<commit_message>
KasiBiz Day 9 Marketing Agent configurationsd
</commit_message>
<xml_diff>
--- a/docs/KasiBiz_System_Handbook.docx
+++ b/docs/KasiBiz_System_Handbook.docx
@@ -327,7 +327,7 @@
                 <w:b w:val="0"/>
                 <w:sz w:val="20"/>
               </w:rPr>
-              <w:t>1.3</w:t>
+              <w:t>1.4</w:t>
             </w:r>
           </w:p>
         </w:tc>
@@ -1472,7 +1472,7 @@
                 <w:b w:val="0"/>
                 <w:sz w:val="20"/>
               </w:rPr>
-              <w:t>~45%</w:t>
+              <w:t>~55%</w:t>
             </w:r>
           </w:p>
         </w:tc>
@@ -3428,9 +3428,11 @@
             <w:r/>
             <w:r>
               <w:rPr>
-                <w:sz w:val="20"/>
-              </w:rPr>
-              <w:t>EMPTY - 0 bytes</w:t>
+                <w:b w:val="0"/>
+                <w:color w:val="129B8E"/>
+                <w:sz w:val="20"/>
+              </w:rPr>
+              <w:t>WORKING - Day 9</w:t>
             </w:r>
           </w:p>
         </w:tc>
@@ -3706,9 +3708,11 @@
             <w:r/>
             <w:r>
               <w:rPr>
-                <w:sz w:val="20"/>
-              </w:rPr>
-              <w:t>EMPTY - 0 bytes</w:t>
+                <w:b w:val="0"/>
+                <w:color w:val="129B8E"/>
+                <w:sz w:val="20"/>
+              </w:rPr>
+              <w:t>WORKING - Day 9</w:t>
             </w:r>
           </w:p>
         </w:tc>
@@ -10540,6 +10544,62 @@
                 <w:sz w:val="20"/>
               </w:rPr>
               <w:t>A local file path - created automatically</w:t>
+            </w:r>
+          </w:p>
+        </w:tc>
+      </w:tr>
+      <w:tr>
+        <w:tc>
+          <w:tcPr>
+            <w:tcW w:type="dxa" w:w="3264"/>
+          </w:tcPr>
+          <w:p>
+            <w:pPr>
+              <w:spacing w:after="40"/>
+            </w:pPr>
+            <w:r/>
+            <w:r>
+              <w:rPr>
+                <w:b/>
+                <w:sz w:val="20"/>
+              </w:rPr>
+              <w:t>SHOP_NAME</w:t>
+            </w:r>
+          </w:p>
+        </w:tc>
+        <w:tc>
+          <w:tcPr>
+            <w:tcW w:type="dxa" w:w="3264"/>
+          </w:tcPr>
+          <w:p>
+            <w:pPr>
+              <w:spacing w:after="40"/>
+            </w:pPr>
+            <w:r/>
+            <w:r>
+              <w:rPr>
+                <w:b w:val="0"/>
+                <w:sz w:val="20"/>
+              </w:rPr>
+              <w:t>No</w:t>
+            </w:r>
+          </w:p>
+        </w:tc>
+        <w:tc>
+          <w:tcPr>
+            <w:tcW w:type="dxa" w:w="3264"/>
+          </w:tcPr>
+          <w:p>
+            <w:pPr>
+              <w:spacing w:after="40"/>
+            </w:pPr>
+            <w:r/>
+            <w:r>
+              <w:rPr>
+                <w:b w:val="0"/>
+                <w:sz w:val="20"/>
+              </w:rPr>
+              <w:t>Optional - names the shop in adverts</w:t>
             </w:r>
           </w:p>
         </w:tc>
@@ -14698,7 +14758,7 @@
                 <w:b w:val="0"/>
                 <w:sz w:val="20"/>
               </w:rPr>
-              <w:t>~45%</w:t>
+              <w:t>~55%</w:t>
             </w:r>
           </w:p>
         </w:tc>
@@ -14775,7 +14835,7 @@
                 <w:b w:val="0"/>
                 <w:sz w:val="20"/>
               </w:rPr>
-              <w:t>Full review of every file in the repository. Confirmed the working LLM connection path. Created the live .env file with a real OpenAI key. Removed the .env.example template. Removed all remaining .env.example references from config.py, README.md and .gitignore. Created this System Handbook. DAY 6 (Stock Database): wrote app/database/schema.sql (products table, case-insensitive unique name index, auto updated_at trigger, low_stock_products view). Wrote app/database/sqlite_db.py with full add/view/update/delete plus adjust_stock, set_stock, low-stock alerts and stock valuation. Money stored as integer cents, never float. Added 53 tests (all passing, 56 total). Added scripts/db_demo.py walkthrough and seeded data/products.csv with 20 real spaza products. Added the six missing __init__.py files and tests/conftest.py, removing the sys.path hack requirement. Fixed the kasibiz.dbgit typo in the live .env. DAY 7 (Stock Agent): built app/services/inventory_service.py - the reorder rules, urgency classification, reorder quantities, order costs and expected profit, all in pure Python. Built app/agents/inventory_agent.py - the Stock Agent, which understands a question, fetches exact facts from the service, then asks the LLM only to phrase them. Added 73 tests (129 total, all passing) and scripts/stock_agent_demo.py. Verified an isiZulu answer in which every Rand figure was still exactly correct. DAY 8 (Pricing Helper): built app/services/pricing_service.py - markup and margin calculations, price suggestions, working backwards from a target margin, practical 50c cash rounding, category-aware price health checks and price-change what-ifs. Built app/agents/pricing_agent.py, which reads Rand amounts out of plain questions and lets the LLM explain the figures in simple terms. Added 105 tests (234 total, all passing) and scripts/pricing_demo.py. Found and fixed a bug where isiZulu questions were being answered in English.</w:t>
+              <w:t>Full review of every file in the repository. Confirmed the working LLM connection path. Created the live .env file with a real OpenAI key. Removed the .env.example template. Removed all remaining .env.example references from config.py, README.md and .gitignore. Created this System Handbook. DAY 6 (Stock Database): wrote app/database/schema.sql (products table, case-insensitive unique name index, auto updated_at trigger, low_stock_products view). Wrote app/database/sqlite_db.py with full add/view/update/delete plus adjust_stock, set_stock, low-stock alerts and stock valuation. Money stored as integer cents, never float. Added 53 tests (all passing, 56 total). Added scripts/db_demo.py walkthrough and seeded data/products.csv with 20 real spaza products. Added the six missing __init__.py files and tests/conftest.py, removing the sys.path hack requirement. Fixed the kasibiz.dbgit typo in the live .env. DAY 7 (Stock Agent): built app/services/inventory_service.py - the reorder rules, urgency classification, reorder quantities, order costs and expected profit, all in pure Python. Built app/agents/inventory_agent.py - the Stock Agent, which understands a question, fetches exact facts from the service, then asks the LLM only to phrase them. Added 73 tests (129 total, all passing) and scripts/stock_agent_demo.py. Verified an isiZulu answer in which every Rand figure was still exactly correct. DAY 8 (Pricing Helper): built app/services/pricing_service.py - markup and margin calculations, price suggestions, working backwards from a target margin, practical 50c cash rounding, category-aware price health checks and price-change what-ifs. Built app/agents/pricing_agent.py, which reads Rand amounts out of plain questions and lets the LLM explain the figures in simple terms. Added 105 tests (234 total, all passing) and scripts/pricing_demo.py. Found and fixed a bug where isiZulu questions were being answered in English. DAY 9 (Marketing Agent): built app/services/marketing_service.py - chooses what is worth promoting, works out discount and bundle maths, and refuses offers that would sell below cost or run the shop out of stock. Built app/agents/marketing_agent.py, which writes WhatsApp adverts, social captions and poster text in three formats and three languages, with plain templates as a fallback when the AI is unavailable. Added SHOP_NAME as an optional .env setting. Added 84 tests (318 total, all passing) and scripts/marketing_demo.py. Found and fixed two bugs during testing.</w:t>
             </w:r>
           </w:p>
         </w:tc>
@@ -15045,7 +15105,7 @@
                 <w:b w:val="0"/>
                 <w:sz w:val="20"/>
               </w:rPr>
-              <w:t>Day 9: the Sales Agent and Calculation Engine (record a sale, total, customer change), then the first Streamlit screen.</w:t>
+              <w:t>Day 10: the Sales Agent and Calculation Engine (record a sale, total, customer change), then the first Streamlit screen.</w:t>
             </w:r>
           </w:p>
         </w:tc>
@@ -15157,7 +15217,7 @@
                 <w:b w:val="0"/>
                 <w:sz w:val="20"/>
               </w:rPr>
-              <w:t>~45%</w:t>
+              <w:t>~55%</w:t>
             </w:r>
           </w:p>
         </w:tc>
@@ -15497,7 +15557,7 @@
                 <w:b w:val="0"/>
                 <w:sz w:val="20"/>
               </w:rPr>
-              <w:t>Day 9: the Sales Agent and Calculation Engine (record a sale, total, customer change), then the first Streamlit screen.</w:t>
+              <w:t>Day 10: the Sales Agent and Calculation Engine (record a sale, total, customer change), then the first Streamlit screen.</w:t>
             </w:r>
           </w:p>
         </w:tc>
@@ -26532,6 +26592,2970 @@
           <w:sz w:val="20"/>
         </w:rPr>
         <w:t>End of Day 8 addendum - handbook version 1.3, 10 September 2026.</w:t>
+      </w:r>
+    </w:p>
+    <w:p>
+      <w:r>
+        <w:br w:type="page"/>
+      </w:r>
+    </w:p>
+    <w:p>
+      <w:pPr>
+        <w:pStyle w:val="Heading1"/>
+        <w:spacing w:before="280" w:after="120"/>
+      </w:pPr>
+      <w:r>
+        <w:rPr>
+          <w:color w:val="129B8E"/>
+        </w:rPr>
+        <w:t>16. Technical Addendum - Day 9: The Marketing Agent</w:t>
+      </w:r>
+    </w:p>
+    <w:p>
+      <w:pPr>
+        <w:spacing w:after="200"/>
+      </w:pPr>
+      <w:r>
+        <w:rPr>
+          <w:b w:val="0"/>
+          <w:i w:val="0"/>
+          <w:sz w:val="22"/>
+        </w:rPr>
+        <w:t>Completed Thursday, 10 September 2026. The Marketing Agent writes WhatsApp adverts, social media captions and shop poster text. It is the first part of KasiBiz where the language model does genuinely creative work rather than just rephrasing, and that change needed a new kind of safety rail.</w:t>
+      </w:r>
+    </w:p>
+    <w:p>
+      <w:pPr>
+        <w:pStyle w:val="Heading2"/>
+        <w:spacing w:before="200" w:after="120"/>
+      </w:pPr>
+      <w:r>
+        <w:rPr>
+          <w:color w:val="17324D"/>
+        </w:rPr>
+        <w:t>16.1 A different role for the AI</w:t>
+      </w:r>
+    </w:p>
+    <w:p>
+      <w:pPr>
+        <w:spacing w:after="120"/>
+      </w:pPr>
+      <w:r>
+        <w:rPr>
+          <w:b w:val="0"/>
+          <w:i w:val="0"/>
+          <w:sz w:val="22"/>
+        </w:rPr>
+        <w:t>Every agent before this one used the language model as a translator. Day 9 uses it as a copywriter. The distinction is worth stating clearly because it changes what can go wrong.</w:t>
+      </w:r>
+    </w:p>
+    <w:tbl>
+      <w:tblPr>
+        <w:tblStyle w:val="TableGrid"/>
+        <w:tblW w:type="auto" w:w="0"/>
+        <w:tblLook w:firstColumn="1" w:firstRow="1" w:lastColumn="0" w:lastRow="0" w:noHBand="0" w:noVBand="1" w:val="04A0"/>
+      </w:tblPr>
+      <w:tblGrid>
+        <w:gridCol w:w="3264"/>
+        <w:gridCol w:w="3264"/>
+        <w:gridCol w:w="3264"/>
+      </w:tblGrid>
+      <w:tr>
+        <w:tc>
+          <w:tcPr>
+            <w:tcW w:type="dxa" w:w="1872"/>
+            <w:shd w:val="clear" w:color="auto" w:fill="17324D"/>
+          </w:tcPr>
+          <w:p>
+            <w:pPr>
+              <w:spacing w:after="40"/>
+            </w:pPr>
+            <w:r/>
+            <w:r>
+              <w:rPr>
+                <w:b/>
+                <w:color w:val="FFFFFF"/>
+                <w:sz w:val="20"/>
+              </w:rPr>
+            </w:r>
+          </w:p>
+        </w:tc>
+        <w:tc>
+          <w:tcPr>
+            <w:tcW w:type="dxa" w:w="3600"/>
+            <w:shd w:val="clear" w:color="auto" w:fill="17324D"/>
+          </w:tcPr>
+          <w:p>
+            <w:pPr>
+              <w:spacing w:after="40"/>
+            </w:pPr>
+            <w:r/>
+            <w:r>
+              <w:rPr>
+                <w:b/>
+                <w:color w:val="FFFFFF"/>
+                <w:sz w:val="20"/>
+              </w:rPr>
+              <w:t>Stock and Pricing agents (Days 7-8)</w:t>
+            </w:r>
+          </w:p>
+        </w:tc>
+        <w:tc>
+          <w:tcPr>
+            <w:tcW w:type="dxa" w:w="4032"/>
+            <w:shd w:val="clear" w:color="auto" w:fill="17324D"/>
+          </w:tcPr>
+          <w:p>
+            <w:pPr>
+              <w:spacing w:after="40"/>
+            </w:pPr>
+            <w:r/>
+            <w:r>
+              <w:rPr>
+                <w:b/>
+                <w:color w:val="FFFFFF"/>
+                <w:sz w:val="20"/>
+              </w:rPr>
+              <w:t>Marketing agent (Day 9)</w:t>
+            </w:r>
+          </w:p>
+        </w:tc>
+      </w:tr>
+      <w:tr>
+        <w:tc>
+          <w:tcPr>
+            <w:tcW w:type="dxa" w:w="1872"/>
+          </w:tcPr>
+          <w:p>
+            <w:pPr>
+              <w:spacing w:after="40"/>
+            </w:pPr>
+            <w:r/>
+            <w:r>
+              <w:rPr>
+                <w:b/>
+                <w:sz w:val="20"/>
+              </w:rPr>
+              <w:t>The AI is a...</w:t>
+            </w:r>
+          </w:p>
+        </w:tc>
+        <w:tc>
+          <w:tcPr>
+            <w:tcW w:type="dxa" w:w="3600"/>
+          </w:tcPr>
+          <w:p>
+            <w:pPr>
+              <w:spacing w:after="40"/>
+            </w:pPr>
+            <w:r/>
+            <w:r>
+              <w:rPr>
+                <w:b w:val="0"/>
+                <w:sz w:val="20"/>
+              </w:rPr>
+              <w:t>Translator</w:t>
+            </w:r>
+          </w:p>
+        </w:tc>
+        <w:tc>
+          <w:tcPr>
+            <w:tcW w:type="dxa" w:w="4032"/>
+          </w:tcPr>
+          <w:p>
+            <w:pPr>
+              <w:spacing w:after="40"/>
+            </w:pPr>
+            <w:r/>
+            <w:r>
+              <w:rPr>
+                <w:b w:val="0"/>
+                <w:sz w:val="20"/>
+              </w:rPr>
+              <w:t>Copywriter</w:t>
+            </w:r>
+          </w:p>
+        </w:tc>
+      </w:tr>
+      <w:tr>
+        <w:tc>
+          <w:tcPr>
+            <w:tcW w:type="dxa" w:w="1872"/>
+            <w:shd w:val="clear" w:color="auto" w:fill="F7FAFB"/>
+          </w:tcPr>
+          <w:p>
+            <w:pPr>
+              <w:spacing w:after="40"/>
+            </w:pPr>
+            <w:r/>
+            <w:r>
+              <w:rPr>
+                <w:b/>
+                <w:sz w:val="20"/>
+              </w:rPr>
+              <w:t>Python decides</w:t>
+            </w:r>
+          </w:p>
+        </w:tc>
+        <w:tc>
+          <w:tcPr>
+            <w:tcW w:type="dxa" w:w="3600"/>
+            <w:shd w:val="clear" w:color="auto" w:fill="F7FAFB"/>
+          </w:tcPr>
+          <w:p>
+            <w:pPr>
+              <w:spacing w:after="40"/>
+            </w:pPr>
+            <w:r/>
+            <w:r>
+              <w:rPr>
+                <w:b w:val="0"/>
+                <w:sz w:val="20"/>
+              </w:rPr>
+              <w:t>The answer</w:t>
+            </w:r>
+          </w:p>
+        </w:tc>
+        <w:tc>
+          <w:tcPr>
+            <w:tcW w:type="dxa" w:w="4032"/>
+            <w:shd w:val="clear" w:color="auto" w:fill="F7FAFB"/>
+          </w:tcPr>
+          <w:p>
+            <w:pPr>
+              <w:spacing w:after="40"/>
+            </w:pPr>
+            <w:r/>
+            <w:r>
+              <w:rPr>
+                <w:b w:val="0"/>
+                <w:sz w:val="20"/>
+              </w:rPr>
+              <w:t>The facts and the limits</w:t>
+            </w:r>
+          </w:p>
+        </w:tc>
+      </w:tr>
+      <w:tr>
+        <w:tc>
+          <w:tcPr>
+            <w:tcW w:type="dxa" w:w="1872"/>
+          </w:tcPr>
+          <w:p>
+            <w:pPr>
+              <w:spacing w:after="40"/>
+            </w:pPr>
+            <w:r/>
+            <w:r>
+              <w:rPr>
+                <w:b/>
+                <w:sz w:val="20"/>
+              </w:rPr>
+              <w:t>The AI decides</w:t>
+            </w:r>
+          </w:p>
+        </w:tc>
+        <w:tc>
+          <w:tcPr>
+            <w:tcW w:type="dxa" w:w="3600"/>
+          </w:tcPr>
+          <w:p>
+            <w:pPr>
+              <w:spacing w:after="40"/>
+            </w:pPr>
+            <w:r/>
+            <w:r>
+              <w:rPr>
+                <w:b w:val="0"/>
+                <w:sz w:val="20"/>
+              </w:rPr>
+              <w:t>Only the wording</w:t>
+            </w:r>
+          </w:p>
+        </w:tc>
+        <w:tc>
+          <w:tcPr>
+            <w:tcW w:type="dxa" w:w="4032"/>
+          </w:tcPr>
+          <w:p>
+            <w:pPr>
+              <w:spacing w:after="40"/>
+            </w:pPr>
+            <w:r/>
+            <w:r>
+              <w:rPr>
+                <w:b w:val="0"/>
+                <w:sz w:val="20"/>
+              </w:rPr>
+              <w:t>The wording, the tone, the whole advert</w:t>
+            </w:r>
+          </w:p>
+        </w:tc>
+      </w:tr>
+      <w:tr>
+        <w:tc>
+          <w:tcPr>
+            <w:tcW w:type="dxa" w:w="1872"/>
+            <w:shd w:val="clear" w:color="auto" w:fill="F7FAFB"/>
+          </w:tcPr>
+          <w:p>
+            <w:pPr>
+              <w:spacing w:after="40"/>
+            </w:pPr>
+            <w:r/>
+            <w:r>
+              <w:rPr>
+                <w:b/>
+                <w:sz w:val="20"/>
+              </w:rPr>
+              <w:t>Main risk</w:t>
+            </w:r>
+          </w:p>
+        </w:tc>
+        <w:tc>
+          <w:tcPr>
+            <w:tcW w:type="dxa" w:w="3600"/>
+            <w:shd w:val="clear" w:color="auto" w:fill="F7FAFB"/>
+          </w:tcPr>
+          <w:p>
+            <w:pPr>
+              <w:spacing w:after="40"/>
+            </w:pPr>
+            <w:r/>
+            <w:r>
+              <w:rPr>
+                <w:b w:val="0"/>
+                <w:sz w:val="20"/>
+              </w:rPr>
+              <w:t>Saying a correct number badly</w:t>
+            </w:r>
+          </w:p>
+        </w:tc>
+        <w:tc>
+          <w:tcPr>
+            <w:tcW w:type="dxa" w:w="4032"/>
+            <w:shd w:val="clear" w:color="auto" w:fill="F7FAFB"/>
+          </w:tcPr>
+          <w:p>
+            <w:pPr>
+              <w:spacing w:after="40"/>
+            </w:pPr>
+            <w:r/>
+            <w:r>
+              <w:rPr>
+                <w:b w:val="0"/>
+                <w:sz w:val="20"/>
+              </w:rPr>
+              <w:t>Promising something the shop cannot deliver</w:t>
+            </w:r>
+          </w:p>
+        </w:tc>
+      </w:tr>
+      <w:tr>
+        <w:tc>
+          <w:tcPr>
+            <w:tcW w:type="dxa" w:w="1872"/>
+          </w:tcPr>
+          <w:p>
+            <w:pPr>
+              <w:spacing w:after="40"/>
+            </w:pPr>
+            <w:r/>
+            <w:r>
+              <w:rPr>
+                <w:b/>
+                <w:sz w:val="20"/>
+              </w:rPr>
+              <w:t>Temperature</w:t>
+            </w:r>
+          </w:p>
+        </w:tc>
+        <w:tc>
+          <w:tcPr>
+            <w:tcW w:type="dxa" w:w="3600"/>
+          </w:tcPr>
+          <w:p>
+            <w:pPr>
+              <w:spacing w:after="40"/>
+            </w:pPr>
+            <w:r/>
+            <w:r>
+              <w:rPr>
+                <w:b w:val="0"/>
+                <w:sz w:val="20"/>
+              </w:rPr>
+              <w:t>0.3 to 0.4 (predictable)</w:t>
+            </w:r>
+          </w:p>
+        </w:tc>
+        <w:tc>
+          <w:tcPr>
+            <w:tcW w:type="dxa" w:w="4032"/>
+          </w:tcPr>
+          <w:p>
+            <w:pPr>
+              <w:spacing w:after="40"/>
+            </w:pPr>
+            <w:r/>
+            <w:r>
+              <w:rPr>
+                <w:b w:val="0"/>
+                <w:sz w:val="20"/>
+              </w:rPr>
+              <w:t>0.85 (creative)</w:t>
+            </w:r>
+          </w:p>
+        </w:tc>
+      </w:tr>
+    </w:tbl>
+    <w:p>
+      <w:pPr>
+        <w:spacing w:after="80"/>
+      </w:pPr>
+    </w:p>
+    <w:tbl>
+      <w:tblPr>
+        <w:tblW w:type="auto" w:w="0"/>
+        <w:tblLook w:firstColumn="1" w:firstRow="1" w:lastColumn="0" w:lastRow="0" w:noHBand="0" w:noVBand="1" w:val="04A0"/>
+      </w:tblPr>
+      <w:tblGrid>
+        <w:gridCol w:w="9792"/>
+      </w:tblGrid>
+      <w:tr>
+        <w:tc>
+          <w:tcPr>
+            <w:tcW w:type="dxa" w:w="9792"/>
+            <w:shd w:val="clear" w:color="auto" w:fill="EAF6F3"/>
+          </w:tcPr>
+          <w:p>
+            <w:pPr>
+              <w:spacing w:after="40"/>
+            </w:pPr>
+            <w:r>
+              <w:rPr>
+                <w:b/>
+                <w:color w:val="129B8E"/>
+                <w:sz w:val="21"/>
+              </w:rPr>
+              <w:t>PLAIN ENGLISH - Say this to management</w:t>
+            </w:r>
+          </w:p>
+          <w:p>
+            <w:pPr>
+              <w:spacing w:after="0"/>
+            </w:pPr>
+            <w:r>
+              <w:rPr>
+                <w:i/>
+                <w:sz w:val="21"/>
+              </w:rPr>
+              <w:t>"Up to now the AI has been our translator - we worked out the answer and it said it nicely. For marketing it is genuinely our copywriter, inventing the words. So we changed the safety approach: instead of checking the answer, we control what the copywriter is allowed to know and allowed to offer."</w:t>
+            </w:r>
+          </w:p>
+        </w:tc>
+      </w:tr>
+    </w:tbl>
+    <w:p>
+      <w:pPr>
+        <w:spacing w:after="80"/>
+      </w:pPr>
+    </w:p>
+    <w:p>
+      <w:pPr>
+        <w:pStyle w:val="Heading2"/>
+        <w:spacing w:before="200" w:after="120"/>
+      </w:pPr>
+      <w:r>
+        <w:rPr>
+          <w:color w:val="17324D"/>
+        </w:rPr>
+        <w:t>16.2 The two adverts KasiBiz refuses to write</w:t>
+      </w:r>
+    </w:p>
+    <w:p>
+      <w:pPr>
+        <w:spacing w:after="120"/>
+      </w:pPr>
+      <w:r>
+        <w:rPr>
+          <w:b w:val="0"/>
+          <w:i w:val="0"/>
+          <w:sz w:val="22"/>
+        </w:rPr>
+        <w:t>The service decides the offer before a single word is written. Two situations stop the campaign completely:</w:t>
+      </w:r>
+    </w:p>
+    <w:tbl>
+      <w:tblPr>
+        <w:tblStyle w:val="TableGrid"/>
+        <w:tblW w:type="auto" w:w="0"/>
+        <w:tblLook w:firstColumn="1" w:firstRow="1" w:lastColumn="0" w:lastRow="0" w:noHBand="0" w:noVBand="1" w:val="04A0"/>
+      </w:tblPr>
+      <w:tblGrid>
+        <w:gridCol w:w="3264"/>
+        <w:gridCol w:w="3264"/>
+        <w:gridCol w:w="3264"/>
+      </w:tblGrid>
+      <w:tr>
+        <w:tc>
+          <w:tcPr>
+            <w:tcW w:type="dxa" w:w="2448"/>
+            <w:shd w:val="clear" w:color="auto" w:fill="17324D"/>
+          </w:tcPr>
+          <w:p>
+            <w:pPr>
+              <w:spacing w:after="40"/>
+            </w:pPr>
+            <w:r/>
+            <w:r>
+              <w:rPr>
+                <w:b/>
+                <w:color w:val="FFFFFF"/>
+                <w:sz w:val="20"/>
+              </w:rPr>
+              <w:t>Situation</w:t>
+            </w:r>
+          </w:p>
+        </w:tc>
+        <w:tc>
+          <w:tcPr>
+            <w:tcW w:type="dxa" w:w="3888"/>
+            <w:shd w:val="clear" w:color="auto" w:fill="17324D"/>
+          </w:tcPr>
+          <w:p>
+            <w:pPr>
+              <w:spacing w:after="40"/>
+            </w:pPr>
+            <w:r/>
+            <w:r>
+              <w:rPr>
+                <w:b/>
+                <w:color w:val="FFFFFF"/>
+                <w:sz w:val="20"/>
+              </w:rPr>
+              <w:t>Why it is blocked</w:t>
+            </w:r>
+          </w:p>
+        </w:tc>
+        <w:tc>
+          <w:tcPr>
+            <w:tcW w:type="dxa" w:w="3168"/>
+            <w:shd w:val="clear" w:color="auto" w:fill="17324D"/>
+          </w:tcPr>
+          <w:p>
+            <w:pPr>
+              <w:spacing w:after="40"/>
+            </w:pPr>
+            <w:r/>
+            <w:r>
+              <w:rPr>
+                <w:b/>
+                <w:color w:val="FFFFFF"/>
+                <w:sz w:val="20"/>
+              </w:rPr>
+              <w:t>What the owner is told</w:t>
+            </w:r>
+          </w:p>
+        </w:tc>
+      </w:tr>
+      <w:tr>
+        <w:tc>
+          <w:tcPr>
+            <w:tcW w:type="dxa" w:w="2448"/>
+          </w:tcPr>
+          <w:p>
+            <w:pPr>
+              <w:spacing w:after="40"/>
+            </w:pPr>
+            <w:r/>
+            <w:r>
+              <w:rPr>
+                <w:b/>
+                <w:sz w:val="20"/>
+              </w:rPr>
+              <w:t>The promotion price is below cost</w:t>
+            </w:r>
+          </w:p>
+        </w:tc>
+        <w:tc>
+          <w:tcPr>
+            <w:tcW w:type="dxa" w:w="3888"/>
+          </w:tcPr>
+          <w:p>
+            <w:pPr>
+              <w:spacing w:after="40"/>
+            </w:pPr>
+            <w:r/>
+            <w:r>
+              <w:rPr>
+                <w:b w:val="0"/>
+                <w:sz w:val="20"/>
+              </w:rPr>
+              <w:t>The shop would lose money on every sale, and a popular advert would make it worse</w:t>
+            </w:r>
+          </w:p>
+        </w:tc>
+        <w:tc>
+          <w:tcPr>
+            <w:tcW w:type="dxa" w:w="3168"/>
+          </w:tcPr>
+          <w:p>
+            <w:pPr>
+              <w:spacing w:after="40"/>
+            </w:pPr>
+            <w:r/>
+            <w:r>
+              <w:rPr>
+                <w:b w:val="0"/>
+                <w:sz w:val="20"/>
+              </w:rPr>
+              <w:t>Do not run this. You would lose money on every one you sell.</w:t>
+            </w:r>
+          </w:p>
+        </w:tc>
+      </w:tr>
+      <w:tr>
+        <w:tc>
+          <w:tcPr>
+            <w:tcW w:type="dxa" w:w="2448"/>
+            <w:shd w:val="clear" w:color="auto" w:fill="F7FAFB"/>
+          </w:tcPr>
+          <w:p>
+            <w:pPr>
+              <w:spacing w:after="40"/>
+            </w:pPr>
+            <w:r/>
+            <w:r>
+              <w:rPr>
+                <w:b/>
+                <w:sz w:val="20"/>
+              </w:rPr>
+              <w:t>Stock is at or near the reorder level</w:t>
+            </w:r>
+          </w:p>
+        </w:tc>
+        <w:tc>
+          <w:tcPr>
+            <w:tcW w:type="dxa" w:w="3888"/>
+            <w:shd w:val="clear" w:color="auto" w:fill="F7FAFB"/>
+          </w:tcPr>
+          <w:p>
+            <w:pPr>
+              <w:spacing w:after="40"/>
+            </w:pPr>
+            <w:r/>
+            <w:r>
+              <w:rPr>
+                <w:b w:val="0"/>
+                <w:sz w:val="20"/>
+              </w:rPr>
+              <w:t>Advertising something you then run out of loses customers rather than winning them</w:t>
+            </w:r>
+          </w:p>
+        </w:tc>
+        <w:tc>
+          <w:tcPr>
+            <w:tcW w:type="dxa" w:w="3168"/>
+            <w:shd w:val="clear" w:color="auto" w:fill="F7FAFB"/>
+          </w:tcPr>
+          <w:p>
+            <w:pPr>
+              <w:spacing w:after="40"/>
+            </w:pPr>
+            <w:r/>
+            <w:r>
+              <w:rPr>
+                <w:b w:val="0"/>
+                <w:sz w:val="20"/>
+              </w:rPr>
+              <w:t>Do not advertise this yet. You will run out and disappoint customers.</w:t>
+            </w:r>
+          </w:p>
+        </w:tc>
+      </w:tr>
+    </w:tbl>
+    <w:p>
+      <w:pPr>
+        <w:spacing w:after="80"/>
+      </w:pPr>
+    </w:p>
+    <w:p>
+      <w:pPr>
+        <w:spacing w:after="120"/>
+      </w:pPr>
+      <w:r>
+        <w:rPr>
+          <w:b w:val="0"/>
+          <w:i w:val="0"/>
+          <w:sz w:val="22"/>
+        </w:rPr>
+        <w:t>A third situation warns without blocking: if the margin is under 10% there is no room to discount, so the advert is written but the owner is cautioned not to promise unlimited quantities.</w:t>
+      </w:r>
+    </w:p>
+    <w:tbl>
+      <w:tblPr>
+        <w:tblW w:type="auto" w:w="0"/>
+        <w:tblLook w:firstColumn="1" w:firstRow="1" w:lastColumn="0" w:lastRow="0" w:noHBand="0" w:noVBand="1" w:val="04A0"/>
+      </w:tblPr>
+      <w:tblGrid>
+        <w:gridCol w:w="9792"/>
+      </w:tblGrid>
+      <w:tr>
+        <w:tc>
+          <w:tcPr>
+            <w:tcW w:type="dxa" w:w="9792"/>
+            <w:shd w:val="clear" w:color="auto" w:fill="FDECEC"/>
+          </w:tcPr>
+          <w:p>
+            <w:pPr>
+              <w:spacing w:after="40"/>
+            </w:pPr>
+            <w:r>
+              <w:rPr>
+                <w:b/>
+                <w:color w:val="B31B1B"/>
+                <w:sz w:val="21"/>
+              </w:rPr>
+              <w:t>THE IMPORTANT PART</w:t>
+            </w:r>
+          </w:p>
+          <w:p>
+            <w:pPr>
+              <w:spacing w:after="0"/>
+            </w:pPr>
+            <w:r>
+              <w:rPr>
+                <w:i/>
+                <w:sz w:val="21"/>
+              </w:rPr>
+              <w:t>In a blocked case the language model is never called at all. The offer does not reach the copywriter, so there is no chance of it being talked into writing the advert anyway. There is a test that proves the model is not invoked.</w:t>
+            </w:r>
+          </w:p>
+        </w:tc>
+      </w:tr>
+    </w:tbl>
+    <w:p>
+      <w:pPr>
+        <w:spacing w:after="80"/>
+      </w:pPr>
+    </w:p>
+    <w:p>
+      <w:pPr>
+        <w:pStyle w:val="Heading2"/>
+        <w:spacing w:before="200" w:after="120"/>
+      </w:pPr>
+      <w:r>
+        <w:rPr>
+          <w:color w:val="17324D"/>
+        </w:rPr>
+        <w:t>16.3 The copywriter never sees the cost price</w:t>
+      </w:r>
+    </w:p>
+    <w:p>
+      <w:pPr>
+        <w:spacing w:after="120"/>
+      </w:pPr>
+      <w:r>
+        <w:rPr>
+          <w:b w:val="0"/>
+          <w:i w:val="0"/>
+          <w:sz w:val="22"/>
+        </w:rPr>
+        <w:t>The factual brief handed to the language model contains the selling price, the promotion price, the saving and the stock level. It deliberately does NOT contain what the owner paid for the item.</w:t>
+      </w:r>
+    </w:p>
+    <w:p>
+      <w:pPr>
+        <w:spacing w:after="160"/>
+      </w:pPr>
+      <w:r>
+        <w:rPr>
+          <w:b w:val="0"/>
+          <w:i w:val="0"/>
+          <w:sz w:val="22"/>
+        </w:rPr>
+        <w:t>The reason is simple: an AI that knows the cost price could put it in an advert. "Was R15, now R18" would be commercially damaging and impossible to take back once it is on a WhatsApp status. There is a test asserting the cost price never appears in the prompt.</w:t>
+      </w:r>
+    </w:p>
+    <w:tbl>
+      <w:tblPr>
+        <w:tblW w:type="auto" w:w="0"/>
+        <w:tblLook w:firstColumn="1" w:firstRow="1" w:lastColumn="0" w:lastRow="0" w:noHBand="0" w:noVBand="1" w:val="04A0"/>
+      </w:tblPr>
+      <w:tblGrid>
+        <w:gridCol w:w="9792"/>
+      </w:tblGrid>
+      <w:tr>
+        <w:tc>
+          <w:tcPr>
+            <w:tcW w:type="dxa" w:w="9792"/>
+            <w:shd w:val="clear" w:color="auto" w:fill="EAF6F3"/>
+          </w:tcPr>
+          <w:p>
+            <w:pPr>
+              <w:spacing w:after="40"/>
+            </w:pPr>
+            <w:r>
+              <w:rPr>
+                <w:b/>
+                <w:color w:val="129B8E"/>
+                <w:sz w:val="21"/>
+              </w:rPr>
+              <w:t>PLAIN ENGLISH - Say this to management</w:t>
+            </w:r>
+          </w:p>
+          <w:p>
+            <w:pPr>
+              <w:spacing w:after="0"/>
+            </w:pPr>
+            <w:r>
+              <w:rPr>
+                <w:i/>
+                <w:sz w:val="21"/>
+              </w:rPr>
+              <w:t>"We never tell the AI what the shop paid for its stock. It only knows what customers pay. That way a slip of the pen can never reveal the owner's margins to the whole neighbourhood."</w:t>
+            </w:r>
+          </w:p>
+        </w:tc>
+      </w:tr>
+    </w:tbl>
+    <w:p>
+      <w:pPr>
+        <w:spacing w:after="80"/>
+      </w:pPr>
+    </w:p>
+    <w:p>
+      <w:pPr>
+        <w:pStyle w:val="Heading2"/>
+        <w:spacing w:before="200" w:after="120"/>
+      </w:pPr>
+      <w:r>
+        <w:rPr>
+          <w:color w:val="17324D"/>
+        </w:rPr>
+        <w:t>16.4 Choosing what is worth promoting</w:t>
+      </w:r>
+    </w:p>
+    <w:p>
+      <w:pPr>
+        <w:spacing w:after="80"/>
+      </w:pPr>
+      <w:r>
+        <w:rPr>
+          <w:b w:val="0"/>
+          <w:i w:val="0"/>
+          <w:sz w:val="22"/>
+        </w:rPr>
+        <w:t>The owner can simply ask "what should I promote this week?" and the service ranks products by two things multiplied together:</w:t>
+      </w:r>
+    </w:p>
+    <w:tbl>
+      <w:tblPr>
+        <w:tblW w:type="auto" w:w="0"/>
+        <w:tblLook w:firstColumn="1" w:firstRow="1" w:lastColumn="0" w:lastRow="0" w:noHBand="0" w:noVBand="1" w:val="04A0"/>
+      </w:tblPr>
+      <w:tblGrid>
+        <w:gridCol w:w="9792"/>
+      </w:tblGrid>
+      <w:tr>
+        <w:tc>
+          <w:tcPr>
+            <w:tcW w:type="dxa" w:w="9792"/>
+            <w:shd w:val="clear" w:color="auto" w:fill="F4F4F4"/>
+          </w:tcPr>
+          <w:p>
+            <w:pPr>
+              <w:spacing w:after="0"/>
+            </w:pPr>
+            <w:r/>
+            <w:r>
+              <w:rPr>
+                <w:rFonts w:ascii="Consolas" w:hAnsi="Consolas"/>
+                <w:sz w:val="18"/>
+              </w:rPr>
+              <w:t xml:space="preserve">  stock cover  =  quantity on hand / reorder alert level</w:t>
+            </w:r>
+          </w:p>
+          <w:p>
+            <w:pPr>
+              <w:spacing w:after="0"/>
+            </w:pPr>
+            <w:r>
+              <w:rPr>
+                <w:rFonts w:ascii="Consolas" w:hAnsi="Consolas"/>
+                <w:sz w:val="18"/>
+              </w:rPr>
+              <w:t xml:space="preserve">  score        =  stock cover  x  profit margin</w:t>
+            </w:r>
+          </w:p>
+          <w:p>
+            <w:pPr>
+              <w:spacing w:after="0"/>
+            </w:pPr>
+            <w:r>
+              <w:rPr>
+                <w:rFonts w:ascii="Consolas" w:hAnsi="Consolas"/>
+                <w:sz w:val="18"/>
+              </w:rPr>
+            </w:r>
+          </w:p>
+          <w:p>
+            <w:pPr>
+              <w:spacing w:after="0"/>
+            </w:pPr>
+            <w:r>
+              <w:rPr>
+                <w:rFonts w:ascii="Consolas" w:hAnsi="Consolas"/>
+                <w:sz w:val="18"/>
+              </w:rPr>
+              <w:t xml:space="preserve">  Excluded: anything below twice its alert level (would run out)</w:t>
+            </w:r>
+          </w:p>
+          <w:p>
+            <w:pPr>
+              <w:spacing w:after="0"/>
+            </w:pPr>
+            <w:r>
+              <w:rPr>
+                <w:rFonts w:ascii="Consolas" w:hAnsi="Consolas"/>
+                <w:sz w:val="18"/>
+              </w:rPr>
+              <w:t xml:space="preserve">  Excluded: anything making no profit (nothing to give away)</w:t>
+            </w:r>
+          </w:p>
+        </w:tc>
+      </w:tr>
+    </w:tbl>
+    <w:p>
+      <w:pPr>
+        <w:spacing w:after="80"/>
+      </w:pPr>
+    </w:p>
+    <w:p>
+      <w:pPr>
+        <w:spacing w:after="160"/>
+      </w:pPr>
+      <w:r>
+        <w:rPr>
+          <w:b w:val="0"/>
+          <w:i w:val="0"/>
+          <w:sz w:val="22"/>
+        </w:rPr>
+        <w:t>In plain terms: promote what you have plenty of and make good money on. That moves stock that is sitting still without putting fast sellers at risk.</w:t>
+      </w:r>
+    </w:p>
+    <w:p>
+      <w:pPr>
+        <w:pStyle w:val="Heading2"/>
+        <w:spacing w:before="200" w:after="120"/>
+      </w:pPr>
+      <w:r>
+        <w:rPr>
+          <w:color w:val="17324D"/>
+        </w:rPr>
+        <w:t>16.5 Offer types and the maths behind them</w:t>
+      </w:r>
+    </w:p>
+    <w:tbl>
+      <w:tblPr>
+        <w:tblStyle w:val="TableGrid"/>
+        <w:tblW w:type="auto" w:w="0"/>
+        <w:tblLook w:firstColumn="1" w:firstRow="1" w:lastColumn="0" w:lastRow="0" w:noHBand="0" w:noVBand="1" w:val="04A0"/>
+      </w:tblPr>
+      <w:tblGrid>
+        <w:gridCol w:w="3264"/>
+        <w:gridCol w:w="3264"/>
+        <w:gridCol w:w="3264"/>
+      </w:tblGrid>
+      <w:tr>
+        <w:tc>
+          <w:tcPr>
+            <w:tcW w:type="dxa" w:w="1728"/>
+            <w:shd w:val="clear" w:color="auto" w:fill="17324D"/>
+          </w:tcPr>
+          <w:p>
+            <w:pPr>
+              <w:spacing w:after="40"/>
+            </w:pPr>
+            <w:r/>
+            <w:r>
+              <w:rPr>
+                <w:b/>
+                <w:color w:val="FFFFFF"/>
+                <w:sz w:val="20"/>
+              </w:rPr>
+              <w:t>Offer</w:t>
+            </w:r>
+          </w:p>
+        </w:tc>
+        <w:tc>
+          <w:tcPr>
+            <w:tcW w:type="dxa" w:w="2880"/>
+            <w:shd w:val="clear" w:color="auto" w:fill="17324D"/>
+          </w:tcPr>
+          <w:p>
+            <w:pPr>
+              <w:spacing w:after="40"/>
+            </w:pPr>
+            <w:r/>
+            <w:r>
+              <w:rPr>
+                <w:b/>
+                <w:color w:val="FFFFFF"/>
+                <w:sz w:val="20"/>
+              </w:rPr>
+              <w:t>Example</w:t>
+            </w:r>
+          </w:p>
+        </w:tc>
+        <w:tc>
+          <w:tcPr>
+            <w:tcW w:type="dxa" w:w="4896"/>
+            <w:shd w:val="clear" w:color="auto" w:fill="17324D"/>
+          </w:tcPr>
+          <w:p>
+            <w:pPr>
+              <w:spacing w:after="40"/>
+            </w:pPr>
+            <w:r/>
+            <w:r>
+              <w:rPr>
+                <w:b/>
+                <w:color w:val="FFFFFF"/>
+                <w:sz w:val="20"/>
+              </w:rPr>
+              <w:t>What is calculated</w:t>
+            </w:r>
+          </w:p>
+        </w:tc>
+      </w:tr>
+      <w:tr>
+        <w:tc>
+          <w:tcPr>
+            <w:tcW w:type="dxa" w:w="1728"/>
+          </w:tcPr>
+          <w:p>
+            <w:pPr>
+              <w:spacing w:after="40"/>
+            </w:pPr>
+            <w:r/>
+            <w:r>
+              <w:rPr>
+                <w:b/>
+                <w:sz w:val="20"/>
+              </w:rPr>
+              <w:t>Straight</w:t>
+            </w:r>
+          </w:p>
+        </w:tc>
+        <w:tc>
+          <w:tcPr>
+            <w:tcW w:type="dxa" w:w="2880"/>
+          </w:tcPr>
+          <w:p>
+            <w:pPr>
+              <w:spacing w:after="40"/>
+            </w:pPr>
+            <w:r/>
+            <w:r>
+              <w:rPr>
+                <w:b w:val="0"/>
+                <w:sz w:val="20"/>
+              </w:rPr>
+              <w:t>White Bread at R20.00</w:t>
+            </w:r>
+          </w:p>
+        </w:tc>
+        <w:tc>
+          <w:tcPr>
+            <w:tcW w:type="dxa" w:w="4896"/>
+          </w:tcPr>
+          <w:p>
+            <w:pPr>
+              <w:spacing w:after="40"/>
+            </w:pPr>
+            <w:r/>
+            <w:r>
+              <w:rPr>
+                <w:b w:val="0"/>
+                <w:sz w:val="20"/>
+              </w:rPr>
+              <w:t>Profit per unit, stock available</w:t>
+            </w:r>
+          </w:p>
+        </w:tc>
+      </w:tr>
+      <w:tr>
+        <w:tc>
+          <w:tcPr>
+            <w:tcW w:type="dxa" w:w="1728"/>
+            <w:shd w:val="clear" w:color="auto" w:fill="F7FAFB"/>
+          </w:tcPr>
+          <w:p>
+            <w:pPr>
+              <w:spacing w:after="40"/>
+            </w:pPr>
+            <w:r/>
+            <w:r>
+              <w:rPr>
+                <w:b/>
+                <w:sz w:val="20"/>
+              </w:rPr>
+              <w:t>Percentage off</w:t>
+            </w:r>
+          </w:p>
+        </w:tc>
+        <w:tc>
+          <w:tcPr>
+            <w:tcW w:type="dxa" w:w="2880"/>
+            <w:shd w:val="clear" w:color="auto" w:fill="F7FAFB"/>
+          </w:tcPr>
+          <w:p>
+            <w:pPr>
+              <w:spacing w:after="40"/>
+            </w:pPr>
+            <w:r/>
+            <w:r>
+              <w:rPr>
+                <w:b w:val="0"/>
+                <w:sz w:val="20"/>
+              </w:rPr>
+              <w:t>10% off White Bread</w:t>
+            </w:r>
+          </w:p>
+        </w:tc>
+        <w:tc>
+          <w:tcPr>
+            <w:tcW w:type="dxa" w:w="4896"/>
+            <w:shd w:val="clear" w:color="auto" w:fill="F7FAFB"/>
+          </w:tcPr>
+          <w:p>
+            <w:pPr>
+              <w:spacing w:after="40"/>
+            </w:pPr>
+            <w:r/>
+            <w:r>
+              <w:rPr>
+                <w:b w:val="0"/>
+                <w:sz w:val="20"/>
+              </w:rPr>
+              <w:t>New price rounded to 50c, saving, remaining profit</w:t>
+            </w:r>
+          </w:p>
+        </w:tc>
+      </w:tr>
+      <w:tr>
+        <w:tc>
+          <w:tcPr>
+            <w:tcW w:type="dxa" w:w="1728"/>
+          </w:tcPr>
+          <w:p>
+            <w:pPr>
+              <w:spacing w:after="40"/>
+            </w:pPr>
+            <w:r/>
+            <w:r>
+              <w:rPr>
+                <w:b/>
+                <w:sz w:val="20"/>
+              </w:rPr>
+              <w:t>Fixed price</w:t>
+            </w:r>
+          </w:p>
+        </w:tc>
+        <w:tc>
+          <w:tcPr>
+            <w:tcW w:type="dxa" w:w="2880"/>
+          </w:tcPr>
+          <w:p>
+            <w:pPr>
+              <w:spacing w:after="40"/>
+            </w:pPr>
+            <w:r/>
+            <w:r>
+              <w:rPr>
+                <w:b w:val="0"/>
+                <w:sz w:val="20"/>
+              </w:rPr>
+              <w:t>White Bread at R17.50</w:t>
+            </w:r>
+          </w:p>
+        </w:tc>
+        <w:tc>
+          <w:tcPr>
+            <w:tcW w:type="dxa" w:w="4896"/>
+          </w:tcPr>
+          <w:p>
+            <w:pPr>
+              <w:spacing w:after="40"/>
+            </w:pPr>
+            <w:r/>
+            <w:r>
+              <w:rPr>
+                <w:b w:val="0"/>
+                <w:sz w:val="20"/>
+              </w:rPr>
+              <w:t>Implied discount, remaining profit</w:t>
+            </w:r>
+          </w:p>
+        </w:tc>
+      </w:tr>
+      <w:tr>
+        <w:tc>
+          <w:tcPr>
+            <w:tcW w:type="dxa" w:w="1728"/>
+            <w:shd w:val="clear" w:color="auto" w:fill="F7FAFB"/>
+          </w:tcPr>
+          <w:p>
+            <w:pPr>
+              <w:spacing w:after="40"/>
+            </w:pPr>
+            <w:r/>
+            <w:r>
+              <w:rPr>
+                <w:b/>
+                <w:sz w:val="20"/>
+              </w:rPr>
+              <w:t>Bundle</w:t>
+            </w:r>
+          </w:p>
+        </w:tc>
+        <w:tc>
+          <w:tcPr>
+            <w:tcW w:type="dxa" w:w="2880"/>
+            <w:shd w:val="clear" w:color="auto" w:fill="F7FAFB"/>
+          </w:tcPr>
+          <w:p>
+            <w:pPr>
+              <w:spacing w:after="40"/>
+            </w:pPr>
+            <w:r/>
+            <w:r>
+              <w:rPr>
+                <w:b w:val="0"/>
+                <w:sz w:val="20"/>
+              </w:rPr>
+              <w:t>2 White Bread for R35.00</w:t>
+            </w:r>
+          </w:p>
+        </w:tc>
+        <w:tc>
+          <w:tcPr>
+            <w:tcW w:type="dxa" w:w="4896"/>
+            <w:shd w:val="clear" w:color="auto" w:fill="F7FAFB"/>
+          </w:tcPr>
+          <w:p>
+            <w:pPr>
+              <w:spacing w:after="40"/>
+            </w:pPr>
+            <w:r/>
+            <w:r>
+              <w:rPr>
+                <w:b w:val="0"/>
+                <w:sz w:val="20"/>
+              </w:rPr>
+              <w:t>Normal cost of 2, saving, profit on the pair, how many pairs are possible</w:t>
+            </w:r>
+          </w:p>
+        </w:tc>
+      </w:tr>
+    </w:tbl>
+    <w:p>
+      <w:pPr>
+        <w:spacing w:after="80"/>
+      </w:pPr>
+    </w:p>
+    <w:p>
+      <w:pPr>
+        <w:spacing w:after="120"/>
+      </w:pPr>
+      <w:r>
+        <w:rPr>
+          <w:b w:val="0"/>
+          <w:i w:val="0"/>
+          <w:sz w:val="22"/>
+        </w:rPr>
+        <w:t>Promotion prices reuse the same 50c cash rounding built for Day 8, so an advert never quotes a price the owner cannot take in coins.</w:t>
+      </w:r>
+    </w:p>
+    <w:p>
+      <w:pPr>
+        <w:spacing w:after="80"/>
+      </w:pPr>
+      <w:r>
+        <w:rPr>
+          <w:b w:val="0"/>
+          <w:i w:val="0"/>
+          <w:sz w:val="22"/>
+        </w:rPr>
+        <w:t>The service also answers "how much discount can this product afford?":</w:t>
+      </w:r>
+    </w:p>
+    <w:tbl>
+      <w:tblPr>
+        <w:tblW w:type="auto" w:w="0"/>
+        <w:tblLook w:firstColumn="1" w:firstRow="1" w:lastColumn="0" w:lastRow="0" w:noHBand="0" w:noVBand="1" w:val="04A0"/>
+      </w:tblPr>
+      <w:tblGrid>
+        <w:gridCol w:w="9792"/>
+      </w:tblGrid>
+      <w:tr>
+        <w:tc>
+          <w:tcPr>
+            <w:tcW w:type="dxa" w:w="9792"/>
+            <w:shd w:val="clear" w:color="auto" w:fill="F4F4F4"/>
+          </w:tcPr>
+          <w:p>
+            <w:pPr>
+              <w:spacing w:after="0"/>
+            </w:pPr>
+            <w:r/>
+            <w:r>
+              <w:rPr>
+                <w:rFonts w:ascii="Consolas" w:hAnsi="Consolas"/>
+                <w:sz w:val="18"/>
+              </w:rPr>
+              <w:t xml:space="preserve">  White Bread      R15.00 cost, R20.00 sell   -&gt;  break-even at 25% off</w:t>
+            </w:r>
+          </w:p>
+          <w:p>
+            <w:pPr>
+              <w:spacing w:after="0"/>
+            </w:pPr>
+            <w:r>
+              <w:rPr>
+                <w:rFonts w:ascii="Consolas" w:hAnsi="Consolas"/>
+                <w:sz w:val="18"/>
+              </w:rPr>
+              <w:t xml:space="preserve">  Simba Chips 36g   R6.50 cost, R10.00 sell   -&gt;  break-even at 35% off</w:t>
+            </w:r>
+          </w:p>
+          <w:p>
+            <w:pPr>
+              <w:spacing w:after="0"/>
+            </w:pPr>
+            <w:r>
+              <w:rPr>
+                <w:rFonts w:ascii="Consolas" w:hAnsi="Consolas"/>
+                <w:sz w:val="18"/>
+              </w:rPr>
+              <w:t xml:space="preserve">  Airtime R12      R11.40 cost, R12.00 sell   -&gt;  break-even at  5% off</w:t>
+            </w:r>
+          </w:p>
+        </w:tc>
+      </w:tr>
+    </w:tbl>
+    <w:p>
+      <w:pPr>
+        <w:spacing w:after="80"/>
+      </w:pPr>
+    </w:p>
+    <w:p>
+      <w:pPr>
+        <w:spacing w:after="160"/>
+      </w:pPr>
+      <w:r>
+        <w:rPr>
+          <w:b w:val="0"/>
+          <w:i w:val="0"/>
+          <w:sz w:val="22"/>
+        </w:rPr>
+        <w:t>When the owner does not specify an offer, KasiBiz suggests one that gives away at most half the profit and never more than 25% off.</w:t>
+      </w:r>
+    </w:p>
+    <w:p>
+      <w:pPr>
+        <w:pStyle w:val="Heading2"/>
+        <w:spacing w:before="200" w:after="120"/>
+      </w:pPr>
+      <w:r>
+        <w:rPr>
+          <w:color w:val="17324D"/>
+        </w:rPr>
+        <w:t>16.6 Three channels, three very different formats</w:t>
+      </w:r>
+    </w:p>
+    <w:tbl>
+      <w:tblPr>
+        <w:tblStyle w:val="TableGrid"/>
+        <w:tblW w:type="auto" w:w="0"/>
+        <w:tblLook w:firstColumn="1" w:firstRow="1" w:lastColumn="0" w:lastRow="0" w:noHBand="0" w:noVBand="1" w:val="04A0"/>
+      </w:tblPr>
+      <w:tblGrid>
+        <w:gridCol w:w="4896"/>
+        <w:gridCol w:w="4896"/>
+      </w:tblGrid>
+      <w:tr>
+        <w:tc>
+          <w:tcPr>
+            <w:tcW w:type="dxa" w:w="2160"/>
+            <w:shd w:val="clear" w:color="auto" w:fill="17324D"/>
+          </w:tcPr>
+          <w:p>
+            <w:pPr>
+              <w:spacing w:after="40"/>
+            </w:pPr>
+            <w:r/>
+            <w:r>
+              <w:rPr>
+                <w:b/>
+                <w:color w:val="FFFFFF"/>
+                <w:sz w:val="20"/>
+              </w:rPr>
+              <w:t>Channel</w:t>
+            </w:r>
+          </w:p>
+        </w:tc>
+        <w:tc>
+          <w:tcPr>
+            <w:tcW w:type="dxa" w:w="7344"/>
+            <w:shd w:val="clear" w:color="auto" w:fill="17324D"/>
+          </w:tcPr>
+          <w:p>
+            <w:pPr>
+              <w:spacing w:after="40"/>
+            </w:pPr>
+            <w:r/>
+            <w:r>
+              <w:rPr>
+                <w:b/>
+                <w:color w:val="FFFFFF"/>
+                <w:sz w:val="20"/>
+              </w:rPr>
+              <w:t>Format rules given to the copywriter</w:t>
+            </w:r>
+          </w:p>
+        </w:tc>
+      </w:tr>
+      <w:tr>
+        <w:tc>
+          <w:tcPr>
+            <w:tcW w:type="dxa" w:w="2160"/>
+          </w:tcPr>
+          <w:p>
+            <w:pPr>
+              <w:spacing w:after="40"/>
+            </w:pPr>
+            <w:r/>
+            <w:r>
+              <w:rPr>
+                <w:b/>
+                <w:sz w:val="20"/>
+              </w:rPr>
+              <w:t>WhatsApp advert</w:t>
+            </w:r>
+          </w:p>
+        </w:tc>
+        <w:tc>
+          <w:tcPr>
+            <w:tcW w:type="dxa" w:w="7344"/>
+          </w:tcPr>
+          <w:p>
+            <w:pPr>
+              <w:spacing w:after="40"/>
+            </w:pPr>
+            <w:r/>
+            <w:r>
+              <w:rPr>
+                <w:b w:val="0"/>
+                <w:sz w:val="20"/>
+              </w:rPr>
+              <w:t>2 to 4 lines, forwardable to a status or community group, a few emoji, ends with the shop name</w:t>
+            </w:r>
+          </w:p>
+        </w:tc>
+      </w:tr>
+      <w:tr>
+        <w:tc>
+          <w:tcPr>
+            <w:tcW w:type="dxa" w:w="2160"/>
+            <w:shd w:val="clear" w:color="auto" w:fill="F7FAFB"/>
+          </w:tcPr>
+          <w:p>
+            <w:pPr>
+              <w:spacing w:after="40"/>
+            </w:pPr>
+            <w:r/>
+            <w:r>
+              <w:rPr>
+                <w:b/>
+                <w:sz w:val="20"/>
+              </w:rPr>
+              <w:t>Social caption</w:t>
+            </w:r>
+          </w:p>
+        </w:tc>
+        <w:tc>
+          <w:tcPr>
+            <w:tcW w:type="dxa" w:w="7344"/>
+            <w:shd w:val="clear" w:color="auto" w:fill="F7FAFB"/>
+          </w:tcPr>
+          <w:p>
+            <w:pPr>
+              <w:spacing w:after="40"/>
+            </w:pPr>
+            <w:r/>
+            <w:r>
+              <w:rPr>
+                <w:b w:val="0"/>
+                <w:sz w:val="20"/>
+              </w:rPr>
+              <w:t>3 to 5 lines for Facebook or Instagram, friendly and playful, 3 to 5 short hashtags</w:t>
+            </w:r>
+          </w:p>
+        </w:tc>
+      </w:tr>
+      <w:tr>
+        <w:tc>
+          <w:tcPr>
+            <w:tcW w:type="dxa" w:w="2160"/>
+          </w:tcPr>
+          <w:p>
+            <w:pPr>
+              <w:spacing w:after="40"/>
+            </w:pPr>
+            <w:r/>
+            <w:r>
+              <w:rPr>
+                <w:b/>
+                <w:sz w:val="20"/>
+              </w:rPr>
+              <w:t>Shop poster</w:t>
+            </w:r>
+          </w:p>
+        </w:tc>
+        <w:tc>
+          <w:tcPr>
+            <w:tcW w:type="dxa" w:w="7344"/>
+          </w:tcPr>
+          <w:p>
+            <w:pPr>
+              <w:spacing w:after="40"/>
+            </w:pPr>
+            <w:r/>
+            <w:r>
+              <w:rPr>
+                <w:b w:val="0"/>
+                <w:sz w:val="20"/>
+              </w:rPr>
+              <w:t>Very few words in capitals, short lines for writing on cardboard, no hashtags or emoji, price is the biggest thing</w:t>
+            </w:r>
+          </w:p>
+        </w:tc>
+      </w:tr>
+    </w:tbl>
+    <w:p>
+      <w:pPr>
+        <w:spacing w:after="80"/>
+      </w:pPr>
+    </w:p>
+    <w:p>
+      <w:pPr>
+        <w:spacing w:after="160"/>
+      </w:pPr>
+      <w:r>
+        <w:rPr>
+          <w:b w:val="0"/>
+          <w:i w:val="0"/>
+          <w:sz w:val="22"/>
+        </w:rPr>
+        <w:t>Asking for a full campaign produces all three from a single offer, so the prices cannot drift between the poster in the window and the advert on WhatsApp.</w:t>
+      </w:r>
+    </w:p>
+    <w:p>
+      <w:pPr>
+        <w:pStyle w:val="Heading2"/>
+        <w:spacing w:before="200" w:after="120"/>
+      </w:pPr>
+      <w:r>
+        <w:rPr>
+          <w:color w:val="17324D"/>
+        </w:rPr>
+        <w:t>16.7 It still works with no AI at all</w:t>
+      </w:r>
+    </w:p>
+    <w:p>
+      <w:pPr>
+        <w:spacing w:after="120"/>
+      </w:pPr>
+      <w:r>
+        <w:rPr>
+          <w:b w:val="0"/>
+          <w:i w:val="0"/>
+          <w:sz w:val="22"/>
+        </w:rPr>
+        <w:t>If the language model is unavailable, the agent falls back to plain templates. The copy is less charming but perfectly usable:</w:t>
+      </w:r>
+    </w:p>
+    <w:tbl>
+      <w:tblPr>
+        <w:tblW w:type="auto" w:w="0"/>
+        <w:tblLook w:firstColumn="1" w:firstRow="1" w:lastColumn="0" w:lastRow="0" w:noHBand="0" w:noVBand="1" w:val="04A0"/>
+      </w:tblPr>
+      <w:tblGrid>
+        <w:gridCol w:w="9792"/>
+      </w:tblGrid>
+      <w:tr>
+        <w:tc>
+          <w:tcPr>
+            <w:tcW w:type="dxa" w:w="9792"/>
+            <w:shd w:val="clear" w:color="auto" w:fill="F4F4F4"/>
+          </w:tcPr>
+          <w:p>
+            <w:pPr>
+              <w:spacing w:after="0"/>
+            </w:pPr>
+            <w:r/>
+            <w:r>
+              <w:rPr>
+                <w:rFonts w:ascii="Consolas" w:hAnsi="Consolas"/>
+                <w:sz w:val="18"/>
+              </w:rPr>
+              <w:t xml:space="preserve">  WhatsApp:                     Poster:</w:t>
+            </w:r>
+          </w:p>
+          <w:p>
+            <w:pPr>
+              <w:spacing w:after="0"/>
+            </w:pPr>
+            <w:r>
+              <w:rPr>
+                <w:rFonts w:ascii="Consolas" w:hAnsi="Consolas"/>
+                <w:sz w:val="18"/>
+              </w:rPr>
+              <w:t xml:space="preserve">  *White Bread - now R18.00*      SPECIAL!</w:t>
+            </w:r>
+          </w:p>
+          <w:p>
+            <w:pPr>
+              <w:spacing w:after="0"/>
+            </w:pPr>
+            <w:r>
+              <w:rPr>
+                <w:rFonts w:ascii="Consolas" w:hAnsi="Consolas"/>
+                <w:sz w:val="18"/>
+              </w:rPr>
+              <w:t xml:space="preserve">  Was R20.00, save R2.00!</w:t>
+            </w:r>
+          </w:p>
+          <w:p>
+            <w:pPr>
+              <w:spacing w:after="0"/>
+            </w:pPr>
+            <w:r>
+              <w:rPr>
+                <w:rFonts w:ascii="Consolas" w:hAnsi="Consolas"/>
+                <w:sz w:val="18"/>
+              </w:rPr>
+              <w:t xml:space="preserve">  Only 60 left at Mama T Spaza.   WHITE BREAD</w:t>
+            </w:r>
+          </w:p>
+          <w:p>
+            <w:pPr>
+              <w:spacing w:after="0"/>
+            </w:pPr>
+            <w:r>
+              <w:rPr>
+                <w:rFonts w:ascii="Consolas" w:hAnsi="Consolas"/>
+                <w:sz w:val="18"/>
+              </w:rPr>
+            </w:r>
+          </w:p>
+          <w:p>
+            <w:pPr>
+              <w:spacing w:after="0"/>
+            </w:pPr>
+            <w:r>
+              <w:rPr>
+                <w:rFonts w:ascii="Consolas" w:hAnsi="Consolas"/>
+                <w:sz w:val="18"/>
+              </w:rPr>
+              <w:t xml:space="preserve">                                  R18.00</w:t>
+            </w:r>
+          </w:p>
+          <w:p>
+            <w:pPr>
+              <w:spacing w:after="0"/>
+            </w:pPr>
+            <w:r>
+              <w:rPr>
+                <w:rFonts w:ascii="Consolas" w:hAnsi="Consolas"/>
+                <w:sz w:val="18"/>
+              </w:rPr>
+              <w:t xml:space="preserve">                                  (was R20.00)</w:t>
+            </w:r>
+          </w:p>
+          <w:p>
+            <w:pPr>
+              <w:spacing w:after="0"/>
+            </w:pPr>
+            <w:r>
+              <w:rPr>
+                <w:rFonts w:ascii="Consolas" w:hAnsi="Consolas"/>
+                <w:sz w:val="18"/>
+              </w:rPr>
+            </w:r>
+          </w:p>
+          <w:p>
+            <w:pPr>
+              <w:spacing w:after="0"/>
+            </w:pPr>
+            <w:r>
+              <w:rPr>
+                <w:rFonts w:ascii="Consolas" w:hAnsi="Consolas"/>
+                <w:sz w:val="18"/>
+              </w:rPr>
+              <w:t xml:space="preserve">                                  WHILE STOCKS LAST</w:t>
+            </w:r>
+          </w:p>
+          <w:p>
+            <w:pPr>
+              <w:spacing w:after="0"/>
+            </w:pPr>
+            <w:r>
+              <w:rPr>
+                <w:rFonts w:ascii="Consolas" w:hAnsi="Consolas"/>
+                <w:sz w:val="18"/>
+              </w:rPr>
+              <w:t xml:space="preserve">                                  MAMA T SPAZA</w:t>
+            </w:r>
+          </w:p>
+        </w:tc>
+      </w:tr>
+    </w:tbl>
+    <w:p>
+      <w:pPr>
+        <w:spacing w:after="80"/>
+      </w:pPr>
+    </w:p>
+    <w:tbl>
+      <w:tblPr>
+        <w:tblW w:type="auto" w:w="0"/>
+        <w:tblLook w:firstColumn="1" w:firstRow="1" w:lastColumn="0" w:lastRow="0" w:noHBand="0" w:noVBand="1" w:val="04A0"/>
+      </w:tblPr>
+      <w:tblGrid>
+        <w:gridCol w:w="9792"/>
+      </w:tblGrid>
+      <w:tr>
+        <w:tc>
+          <w:tcPr>
+            <w:tcW w:type="dxa" w:w="9792"/>
+            <w:shd w:val="clear" w:color="auto" w:fill="EAF6F3"/>
+          </w:tcPr>
+          <w:p>
+            <w:pPr>
+              <w:spacing w:after="40"/>
+            </w:pPr>
+            <w:r>
+              <w:rPr>
+                <w:b/>
+                <w:color w:val="129B8E"/>
+                <w:sz w:val="21"/>
+              </w:rPr>
+              <w:t>PLAIN ENGLISH - Say this to management</w:t>
+            </w:r>
+          </w:p>
+          <w:p>
+            <w:pPr>
+              <w:spacing w:after="0"/>
+            </w:pPr>
+            <w:r>
+              <w:rPr>
+                <w:i/>
+                <w:sz w:val="21"/>
+              </w:rPr>
+              <w:t>"Even with no internet and no AI credit, the shop owner still gets an advert they can put in the window or send to customers. The AI makes it better; it is not what makes it work."</w:t>
+            </w:r>
+          </w:p>
+        </w:tc>
+      </w:tr>
+    </w:tbl>
+    <w:p>
+      <w:pPr>
+        <w:spacing w:after="80"/>
+      </w:pPr>
+    </w:p>
+    <w:p>
+      <w:pPr>
+        <w:pStyle w:val="Heading2"/>
+        <w:spacing w:before="200" w:after="120"/>
+      </w:pPr>
+      <w:r>
+        <w:rPr>
+          <w:color w:val="17324D"/>
+        </w:rPr>
+        <w:t>16.8 Two bugs found during testing</w:t>
+      </w:r>
+    </w:p>
+    <w:p>
+      <w:pPr>
+        <w:spacing w:after="120"/>
+      </w:pPr>
+      <w:r>
+        <w:rPr>
+          <w:b w:val="0"/>
+          <w:i w:val="0"/>
+          <w:sz w:val="22"/>
+        </w:rPr>
+        <w:t>Both were caught by tests before anything reached the demo.</w:t>
+      </w:r>
+    </w:p>
+    <w:tbl>
+      <w:tblPr>
+        <w:tblStyle w:val="TableGrid"/>
+        <w:tblW w:type="auto" w:w="0"/>
+        <w:tblLook w:firstColumn="1" w:firstRow="1" w:lastColumn="0" w:lastRow="0" w:noHBand="0" w:noVBand="1" w:val="04A0"/>
+      </w:tblPr>
+      <w:tblGrid>
+        <w:gridCol w:w="3264"/>
+        <w:gridCol w:w="3264"/>
+        <w:gridCol w:w="3264"/>
+      </w:tblGrid>
+      <w:tr>
+        <w:tc>
+          <w:tcPr>
+            <w:tcW w:type="dxa" w:w="2304"/>
+            <w:shd w:val="clear" w:color="auto" w:fill="17324D"/>
+          </w:tcPr>
+          <w:p>
+            <w:pPr>
+              <w:spacing w:after="40"/>
+            </w:pPr>
+            <w:r/>
+            <w:r>
+              <w:rPr>
+                <w:b/>
+                <w:color w:val="FFFFFF"/>
+                <w:sz w:val="20"/>
+              </w:rPr>
+              <w:t>Bug</w:t>
+            </w:r>
+          </w:p>
+        </w:tc>
+        <w:tc>
+          <w:tcPr>
+            <w:tcW w:type="dxa" w:w="3744"/>
+            <w:shd w:val="clear" w:color="auto" w:fill="17324D"/>
+          </w:tcPr>
+          <w:p>
+            <w:pPr>
+              <w:spacing w:after="40"/>
+            </w:pPr>
+            <w:r/>
+            <w:r>
+              <w:rPr>
+                <w:b/>
+                <w:color w:val="FFFFFF"/>
+                <w:sz w:val="20"/>
+              </w:rPr>
+              <w:t>What went wrong</w:t>
+            </w:r>
+          </w:p>
+        </w:tc>
+        <w:tc>
+          <w:tcPr>
+            <w:tcW w:type="dxa" w:w="3456"/>
+            <w:shd w:val="clear" w:color="auto" w:fill="17324D"/>
+          </w:tcPr>
+          <w:p>
+            <w:pPr>
+              <w:spacing w:after="40"/>
+            </w:pPr>
+            <w:r/>
+            <w:r>
+              <w:rPr>
+                <w:b/>
+                <w:color w:val="FFFFFF"/>
+                <w:sz w:val="20"/>
+              </w:rPr>
+              <w:t>Fix</w:t>
+            </w:r>
+          </w:p>
+        </w:tc>
+      </w:tr>
+      <w:tr>
+        <w:tc>
+          <w:tcPr>
+            <w:tcW w:type="dxa" w:w="2304"/>
+          </w:tcPr>
+          <w:p>
+            <w:pPr>
+              <w:spacing w:after="40"/>
+            </w:pPr>
+            <w:r/>
+            <w:r>
+              <w:rPr>
+                <w:b/>
+                <w:sz w:val="20"/>
+              </w:rPr>
+              <w:t>Bundles were not recognised</w:t>
+            </w:r>
+          </w:p>
+        </w:tc>
+        <w:tc>
+          <w:tcPr>
+            <w:tcW w:type="dxa" w:w="3744"/>
+          </w:tcPr>
+          <w:p>
+            <w:pPr>
+              <w:spacing w:after="40"/>
+            </w:pPr>
+            <w:r/>
+            <w:r>
+              <w:rPr>
+                <w:b w:val="0"/>
+                <w:sz w:val="20"/>
+              </w:rPr>
+              <w:t>"2 White Bread for R35" was read as an ordinary discount, because the pattern expected the word 'for' immediately after the number</w:t>
+            </w:r>
+          </w:p>
+        </w:tc>
+        <w:tc>
+          <w:tcPr>
+            <w:tcW w:type="dxa" w:w="3456"/>
+          </w:tcPr>
+          <w:p>
+            <w:pPr>
+              <w:spacing w:after="40"/>
+            </w:pPr>
+            <w:r/>
+            <w:r>
+              <w:rPr>
+                <w:b w:val="0"/>
+                <w:sz w:val="20"/>
+              </w:rPr>
+              <w:t>Allow the product name to sit between the quantity and the price, and cap the quantity at two digits so "Coca-Cola 500ml for R18" is not read as 500 units</w:t>
+            </w:r>
+          </w:p>
+        </w:tc>
+      </w:tr>
+      <w:tr>
+        <w:tc>
+          <w:tcPr>
+            <w:tcW w:type="dxa" w:w="2304"/>
+            <w:shd w:val="clear" w:color="auto" w:fill="F7FAFB"/>
+          </w:tcPr>
+          <w:p>
+            <w:pPr>
+              <w:spacing w:after="40"/>
+            </w:pPr>
+            <w:r/>
+            <w:r>
+              <w:rPr>
+                <w:b/>
+                <w:sz w:val="20"/>
+              </w:rPr>
+              <w:t>Thin margins were rated as safe</w:t>
+            </w:r>
+          </w:p>
+        </w:tc>
+        <w:tc>
+          <w:tcPr>
+            <w:tcW w:type="dxa" w:w="3744"/>
+            <w:shd w:val="clear" w:color="auto" w:fill="F7FAFB"/>
+          </w:tcPr>
+          <w:p>
+            <w:pPr>
+              <w:spacing w:after="40"/>
+            </w:pPr>
+            <w:r/>
+            <w:r>
+              <w:rPr>
+                <w:b w:val="0"/>
+                <w:sz w:val="20"/>
+              </w:rPr>
+              <w:t>Airtime at exactly 5% margin passed the check, because the rule was 'less than 5%'</w:t>
+            </w:r>
+          </w:p>
+        </w:tc>
+        <w:tc>
+          <w:tcPr>
+            <w:tcW w:type="dxa" w:w="3456"/>
+            <w:shd w:val="clear" w:color="auto" w:fill="F7FAFB"/>
+          </w:tcPr>
+          <w:p>
+            <w:pPr>
+              <w:spacing w:after="40"/>
+            </w:pPr>
+            <w:r/>
+            <w:r>
+              <w:rPr>
+                <w:b w:val="0"/>
+                <w:sz w:val="20"/>
+              </w:rPr>
+              <w:t>Raised the marketing safety margin to 10%, which is deliberately stricter than the everyday pricing minimums - a product you cannot discount should be flagged</w:t>
+            </w:r>
+          </w:p>
+        </w:tc>
+      </w:tr>
+    </w:tbl>
+    <w:p>
+      <w:pPr>
+        <w:spacing w:after="80"/>
+      </w:pPr>
+    </w:p>
+    <w:tbl>
+      <w:tblPr>
+        <w:tblW w:type="auto" w:w="0"/>
+        <w:tblLook w:firstColumn="1" w:firstRow="1" w:lastColumn="0" w:lastRow="0" w:noHBand="0" w:noVBand="1" w:val="04A0"/>
+      </w:tblPr>
+      <w:tblGrid>
+        <w:gridCol w:w="9792"/>
+      </w:tblGrid>
+      <w:tr>
+        <w:tc>
+          <w:tcPr>
+            <w:tcW w:type="dxa" w:w="9792"/>
+            <w:shd w:val="clear" w:color="auto" w:fill="FFF4DB"/>
+          </w:tcPr>
+          <w:p>
+            <w:pPr>
+              <w:spacing w:after="40"/>
+            </w:pPr>
+            <w:r>
+              <w:rPr>
+                <w:b/>
+                <w:color w:val="9A6200"/>
+                <w:sz w:val="21"/>
+              </w:rPr>
+              <w:t>LESSON WORTH KEEPING</w:t>
+            </w:r>
+          </w:p>
+          <w:p>
+            <w:pPr>
+              <w:spacing w:after="0"/>
+            </w:pPr>
+            <w:r>
+              <w:rPr>
+                <w:i/>
+                <w:sz w:val="21"/>
+              </w:rPr>
+              <w:t>Both bugs were boundary problems: one about where a pattern starts, one about whether a limit includes its own edge. Neither would have been obvious from reading the code. This is exactly what tests are for.</w:t>
+            </w:r>
+          </w:p>
+        </w:tc>
+      </w:tr>
+    </w:tbl>
+    <w:p>
+      <w:pPr>
+        <w:spacing w:after="80"/>
+      </w:pPr>
+    </w:p>
+    <w:p>
+      <w:pPr>
+        <w:pStyle w:val="Heading2"/>
+        <w:spacing w:before="200" w:after="120"/>
+      </w:pPr>
+      <w:r>
+        <w:rPr>
+          <w:color w:val="17324D"/>
+        </w:rPr>
+        <w:t>16.9 New setting: SHOP_NAME</w:t>
+      </w:r>
+    </w:p>
+    <w:p>
+      <w:pPr>
+        <w:spacing w:after="80"/>
+      </w:pPr>
+      <w:r>
+        <w:rPr>
+          <w:b w:val="0"/>
+          <w:i w:val="0"/>
+          <w:sz w:val="22"/>
+        </w:rPr>
+        <w:t>Adverts need to be signed with the shop's name. Following the four-step rule in Section 7.5, SHOP_NAME has been added to .env, to the Settings object, to load_settings(), and to the table in Section 7.1.</w:t>
+      </w:r>
+    </w:p>
+    <w:tbl>
+      <w:tblPr>
+        <w:tblW w:type="auto" w:w="0"/>
+        <w:tblLook w:firstColumn="1" w:firstRow="1" w:lastColumn="0" w:lastRow="0" w:noHBand="0" w:noVBand="1" w:val="04A0"/>
+      </w:tblPr>
+      <w:tblGrid>
+        <w:gridCol w:w="9792"/>
+      </w:tblGrid>
+      <w:tr>
+        <w:tc>
+          <w:tcPr>
+            <w:tcW w:type="dxa" w:w="9792"/>
+            <w:shd w:val="clear" w:color="auto" w:fill="F4F4F4"/>
+          </w:tcPr>
+          <w:p>
+            <w:pPr>
+              <w:spacing w:after="0"/>
+            </w:pPr>
+            <w:r/>
+            <w:r>
+              <w:rPr>
+                <w:rFonts w:ascii="Consolas" w:hAnsi="Consolas"/>
+                <w:sz w:val="18"/>
+              </w:rPr>
+              <w:t xml:space="preserve">  # .env</w:t>
+            </w:r>
+          </w:p>
+          <w:p>
+            <w:pPr>
+              <w:spacing w:after="0"/>
+            </w:pPr>
+            <w:r>
+              <w:rPr>
+                <w:rFonts w:ascii="Consolas" w:hAnsi="Consolas"/>
+                <w:sz w:val="18"/>
+              </w:rPr>
+              <w:t xml:space="preserve">  SHOP_NAME=Mama T Spaza</w:t>
+            </w:r>
+          </w:p>
+        </w:tc>
+      </w:tr>
+    </w:tbl>
+    <w:p>
+      <w:pPr>
+        <w:spacing w:after="80"/>
+      </w:pPr>
+    </w:p>
+    <w:p>
+      <w:pPr>
+        <w:spacing w:after="160"/>
+      </w:pPr>
+      <w:r>
+        <w:rPr>
+          <w:b w:val="0"/>
+          <w:i w:val="0"/>
+          <w:sz w:val="22"/>
+        </w:rPr>
+        <w:t>It is optional and not a secret. If it is missing, KasiBiz uses "KasiBiz Spaza", so nobody's existing .env breaks.</w:t>
+      </w:r>
+    </w:p>
+    <w:p>
+      <w:pPr>
+        <w:pStyle w:val="Heading2"/>
+        <w:spacing w:before="200" w:after="120"/>
+      </w:pPr>
+      <w:r>
+        <w:rPr>
+          <w:color w:val="17324D"/>
+        </w:rPr>
+        <w:t>16.10 Testing</w:t>
+      </w:r>
+    </w:p>
+    <w:tbl>
+      <w:tblPr>
+        <w:tblStyle w:val="TableGrid"/>
+        <w:tblW w:type="auto" w:w="0"/>
+        <w:tblLook w:firstColumn="1" w:firstRow="1" w:lastColumn="0" w:lastRow="0" w:noHBand="0" w:noVBand="1" w:val="04A0"/>
+      </w:tblPr>
+      <w:tblGrid>
+        <w:gridCol w:w="3264"/>
+        <w:gridCol w:w="3264"/>
+        <w:gridCol w:w="3264"/>
+      </w:tblGrid>
+      <w:tr>
+        <w:tc>
+          <w:tcPr>
+            <w:tcW w:type="dxa" w:w="3744"/>
+            <w:shd w:val="clear" w:color="auto" w:fill="17324D"/>
+          </w:tcPr>
+          <w:p>
+            <w:pPr>
+              <w:spacing w:after="40"/>
+            </w:pPr>
+            <w:r/>
+            <w:r>
+              <w:rPr>
+                <w:b/>
+                <w:color w:val="FFFFFF"/>
+                <w:sz w:val="20"/>
+              </w:rPr>
+              <w:t>Suite</w:t>
+            </w:r>
+          </w:p>
+        </w:tc>
+        <w:tc>
+          <w:tcPr>
+            <w:tcW w:type="dxa" w:w="2016"/>
+            <w:shd w:val="clear" w:color="auto" w:fill="17324D"/>
+          </w:tcPr>
+          <w:p>
+            <w:pPr>
+              <w:spacing w:after="40"/>
+            </w:pPr>
+            <w:r/>
+            <w:r>
+              <w:rPr>
+                <w:b/>
+                <w:color w:val="FFFFFF"/>
+                <w:sz w:val="20"/>
+              </w:rPr>
+              <w:t>Tests</w:t>
+            </w:r>
+          </w:p>
+        </w:tc>
+        <w:tc>
+          <w:tcPr>
+            <w:tcW w:type="dxa" w:w="3744"/>
+            <w:shd w:val="clear" w:color="auto" w:fill="17324D"/>
+          </w:tcPr>
+          <w:p>
+            <w:pPr>
+              <w:spacing w:after="40"/>
+            </w:pPr>
+            <w:r/>
+            <w:r>
+              <w:rPr>
+                <w:b/>
+                <w:color w:val="FFFFFF"/>
+                <w:sz w:val="20"/>
+              </w:rPr>
+              <w:t>Needs internet or a key?</w:t>
+            </w:r>
+          </w:p>
+        </w:tc>
+      </w:tr>
+      <w:tr>
+        <w:tc>
+          <w:tcPr>
+            <w:tcW w:type="dxa" w:w="3744"/>
+          </w:tcPr>
+          <w:p>
+            <w:pPr>
+              <w:spacing w:after="40"/>
+            </w:pPr>
+            <w:r/>
+            <w:r>
+              <w:rPr>
+                <w:b/>
+                <w:sz w:val="20"/>
+              </w:rPr>
+              <w:t>tests/test_database.py</w:t>
+            </w:r>
+          </w:p>
+        </w:tc>
+        <w:tc>
+          <w:tcPr>
+            <w:tcW w:type="dxa" w:w="2016"/>
+          </w:tcPr>
+          <w:p>
+            <w:pPr>
+              <w:spacing w:after="40"/>
+            </w:pPr>
+            <w:r/>
+            <w:r>
+              <w:rPr>
+                <w:b w:val="0"/>
+                <w:sz w:val="20"/>
+              </w:rPr>
+              <w:t>53</w:t>
+            </w:r>
+          </w:p>
+        </w:tc>
+        <w:tc>
+          <w:tcPr>
+            <w:tcW w:type="dxa" w:w="3744"/>
+          </w:tcPr>
+          <w:p>
+            <w:pPr>
+              <w:spacing w:after="40"/>
+            </w:pPr>
+            <w:r/>
+            <w:r>
+              <w:rPr>
+                <w:b w:val="0"/>
+                <w:sz w:val="20"/>
+              </w:rPr>
+              <w:t>No</w:t>
+            </w:r>
+          </w:p>
+        </w:tc>
+      </w:tr>
+      <w:tr>
+        <w:tc>
+          <w:tcPr>
+            <w:tcW w:type="dxa" w:w="3744"/>
+            <w:shd w:val="clear" w:color="auto" w:fill="F7FAFB"/>
+          </w:tcPr>
+          <w:p>
+            <w:pPr>
+              <w:spacing w:after="40"/>
+            </w:pPr>
+            <w:r/>
+            <w:r>
+              <w:rPr>
+                <w:b/>
+                <w:sz w:val="20"/>
+              </w:rPr>
+              <w:t>tests/test_inventory_service.py</w:t>
+            </w:r>
+          </w:p>
+        </w:tc>
+        <w:tc>
+          <w:tcPr>
+            <w:tcW w:type="dxa" w:w="2016"/>
+            <w:shd w:val="clear" w:color="auto" w:fill="F7FAFB"/>
+          </w:tcPr>
+          <w:p>
+            <w:pPr>
+              <w:spacing w:after="40"/>
+            </w:pPr>
+            <w:r/>
+            <w:r>
+              <w:rPr>
+                <w:b w:val="0"/>
+                <w:sz w:val="20"/>
+              </w:rPr>
+              <w:t>43</w:t>
+            </w:r>
+          </w:p>
+        </w:tc>
+        <w:tc>
+          <w:tcPr>
+            <w:tcW w:type="dxa" w:w="3744"/>
+            <w:shd w:val="clear" w:color="auto" w:fill="F7FAFB"/>
+          </w:tcPr>
+          <w:p>
+            <w:pPr>
+              <w:spacing w:after="40"/>
+            </w:pPr>
+            <w:r/>
+            <w:r>
+              <w:rPr>
+                <w:b w:val="0"/>
+                <w:sz w:val="20"/>
+              </w:rPr>
+              <w:t>No</w:t>
+            </w:r>
+          </w:p>
+        </w:tc>
+      </w:tr>
+      <w:tr>
+        <w:tc>
+          <w:tcPr>
+            <w:tcW w:type="dxa" w:w="3744"/>
+          </w:tcPr>
+          <w:p>
+            <w:pPr>
+              <w:spacing w:after="40"/>
+            </w:pPr>
+            <w:r/>
+            <w:r>
+              <w:rPr>
+                <w:b/>
+                <w:sz w:val="20"/>
+              </w:rPr>
+              <w:t>tests/test_stock_agent.py</w:t>
+            </w:r>
+          </w:p>
+        </w:tc>
+        <w:tc>
+          <w:tcPr>
+            <w:tcW w:type="dxa" w:w="2016"/>
+          </w:tcPr>
+          <w:p>
+            <w:pPr>
+              <w:spacing w:after="40"/>
+            </w:pPr>
+            <w:r/>
+            <w:r>
+              <w:rPr>
+                <w:b w:val="0"/>
+                <w:sz w:val="20"/>
+              </w:rPr>
+              <w:t>30</w:t>
+            </w:r>
+          </w:p>
+        </w:tc>
+        <w:tc>
+          <w:tcPr>
+            <w:tcW w:type="dxa" w:w="3744"/>
+          </w:tcPr>
+          <w:p>
+            <w:pPr>
+              <w:spacing w:after="40"/>
+            </w:pPr>
+            <w:r/>
+            <w:r>
+              <w:rPr>
+                <w:b w:val="0"/>
+                <w:sz w:val="20"/>
+              </w:rPr>
+              <w:t>No</w:t>
+            </w:r>
+          </w:p>
+        </w:tc>
+      </w:tr>
+      <w:tr>
+        <w:tc>
+          <w:tcPr>
+            <w:tcW w:type="dxa" w:w="3744"/>
+            <w:shd w:val="clear" w:color="auto" w:fill="F7FAFB"/>
+          </w:tcPr>
+          <w:p>
+            <w:pPr>
+              <w:spacing w:after="40"/>
+            </w:pPr>
+            <w:r/>
+            <w:r>
+              <w:rPr>
+                <w:b/>
+                <w:sz w:val="20"/>
+              </w:rPr>
+              <w:t>tests/test_pricing_service.py</w:t>
+            </w:r>
+          </w:p>
+        </w:tc>
+        <w:tc>
+          <w:tcPr>
+            <w:tcW w:type="dxa" w:w="2016"/>
+            <w:shd w:val="clear" w:color="auto" w:fill="F7FAFB"/>
+          </w:tcPr>
+          <w:p>
+            <w:pPr>
+              <w:spacing w:after="40"/>
+            </w:pPr>
+            <w:r/>
+            <w:r>
+              <w:rPr>
+                <w:b w:val="0"/>
+                <w:sz w:val="20"/>
+              </w:rPr>
+              <w:t>60</w:t>
+            </w:r>
+          </w:p>
+        </w:tc>
+        <w:tc>
+          <w:tcPr>
+            <w:tcW w:type="dxa" w:w="3744"/>
+            <w:shd w:val="clear" w:color="auto" w:fill="F7FAFB"/>
+          </w:tcPr>
+          <w:p>
+            <w:pPr>
+              <w:spacing w:after="40"/>
+            </w:pPr>
+            <w:r/>
+            <w:r>
+              <w:rPr>
+                <w:b w:val="0"/>
+                <w:sz w:val="20"/>
+              </w:rPr>
+              <w:t>No</w:t>
+            </w:r>
+          </w:p>
+        </w:tc>
+      </w:tr>
+      <w:tr>
+        <w:tc>
+          <w:tcPr>
+            <w:tcW w:type="dxa" w:w="3744"/>
+          </w:tcPr>
+          <w:p>
+            <w:pPr>
+              <w:spacing w:after="40"/>
+            </w:pPr>
+            <w:r/>
+            <w:r>
+              <w:rPr>
+                <w:b/>
+                <w:sz w:val="20"/>
+              </w:rPr>
+              <w:t>tests/test_pricing_agent.py</w:t>
+            </w:r>
+          </w:p>
+        </w:tc>
+        <w:tc>
+          <w:tcPr>
+            <w:tcW w:type="dxa" w:w="2016"/>
+          </w:tcPr>
+          <w:p>
+            <w:pPr>
+              <w:spacing w:after="40"/>
+            </w:pPr>
+            <w:r/>
+            <w:r>
+              <w:rPr>
+                <w:b w:val="0"/>
+                <w:sz w:val="20"/>
+              </w:rPr>
+              <w:t>45</w:t>
+            </w:r>
+          </w:p>
+        </w:tc>
+        <w:tc>
+          <w:tcPr>
+            <w:tcW w:type="dxa" w:w="3744"/>
+          </w:tcPr>
+          <w:p>
+            <w:pPr>
+              <w:spacing w:after="40"/>
+            </w:pPr>
+            <w:r/>
+            <w:r>
+              <w:rPr>
+                <w:b w:val="0"/>
+                <w:sz w:val="20"/>
+              </w:rPr>
+              <w:t>No</w:t>
+            </w:r>
+          </w:p>
+        </w:tc>
+      </w:tr>
+      <w:tr>
+        <w:tc>
+          <w:tcPr>
+            <w:tcW w:type="dxa" w:w="3744"/>
+            <w:shd w:val="clear" w:color="auto" w:fill="F7FAFB"/>
+          </w:tcPr>
+          <w:p>
+            <w:pPr>
+              <w:spacing w:after="40"/>
+            </w:pPr>
+            <w:r/>
+            <w:r>
+              <w:rPr>
+                <w:b/>
+                <w:sz w:val="20"/>
+              </w:rPr>
+              <w:t>tests/test_marketing_service.py</w:t>
+            </w:r>
+          </w:p>
+        </w:tc>
+        <w:tc>
+          <w:tcPr>
+            <w:tcW w:type="dxa" w:w="2016"/>
+            <w:shd w:val="clear" w:color="auto" w:fill="F7FAFB"/>
+          </w:tcPr>
+          <w:p>
+            <w:pPr>
+              <w:spacing w:after="40"/>
+            </w:pPr>
+            <w:r/>
+            <w:r>
+              <w:rPr>
+                <w:b w:val="0"/>
+                <w:sz w:val="20"/>
+              </w:rPr>
+              <w:t>45</w:t>
+            </w:r>
+          </w:p>
+        </w:tc>
+        <w:tc>
+          <w:tcPr>
+            <w:tcW w:type="dxa" w:w="3744"/>
+            <w:shd w:val="clear" w:color="auto" w:fill="F7FAFB"/>
+          </w:tcPr>
+          <w:p>
+            <w:pPr>
+              <w:spacing w:after="40"/>
+            </w:pPr>
+            <w:r/>
+            <w:r>
+              <w:rPr>
+                <w:b w:val="0"/>
+                <w:sz w:val="20"/>
+              </w:rPr>
+              <w:t>No</w:t>
+            </w:r>
+          </w:p>
+        </w:tc>
+      </w:tr>
+      <w:tr>
+        <w:tc>
+          <w:tcPr>
+            <w:tcW w:type="dxa" w:w="3744"/>
+          </w:tcPr>
+          <w:p>
+            <w:pPr>
+              <w:spacing w:after="40"/>
+            </w:pPr>
+            <w:r/>
+            <w:r>
+              <w:rPr>
+                <w:b/>
+                <w:sz w:val="20"/>
+              </w:rPr>
+              <w:t>tests/test_marketing_agent.py</w:t>
+            </w:r>
+          </w:p>
+        </w:tc>
+        <w:tc>
+          <w:tcPr>
+            <w:tcW w:type="dxa" w:w="2016"/>
+          </w:tcPr>
+          <w:p>
+            <w:pPr>
+              <w:spacing w:after="40"/>
+            </w:pPr>
+            <w:r/>
+            <w:r>
+              <w:rPr>
+                <w:b w:val="0"/>
+                <w:sz w:val="20"/>
+              </w:rPr>
+              <w:t>39</w:t>
+            </w:r>
+          </w:p>
+        </w:tc>
+        <w:tc>
+          <w:tcPr>
+            <w:tcW w:type="dxa" w:w="3744"/>
+          </w:tcPr>
+          <w:p>
+            <w:pPr>
+              <w:spacing w:after="40"/>
+            </w:pPr>
+            <w:r/>
+            <w:r>
+              <w:rPr>
+                <w:b w:val="0"/>
+                <w:sz w:val="20"/>
+              </w:rPr>
+              <w:t>No</w:t>
+            </w:r>
+          </w:p>
+        </w:tc>
+      </w:tr>
+      <w:tr>
+        <w:tc>
+          <w:tcPr>
+            <w:tcW w:type="dxa" w:w="3744"/>
+            <w:shd w:val="clear" w:color="auto" w:fill="F7FAFB"/>
+          </w:tcPr>
+          <w:p>
+            <w:pPr>
+              <w:spacing w:after="40"/>
+            </w:pPr>
+            <w:r/>
+            <w:r>
+              <w:rPr>
+                <w:b/>
+                <w:sz w:val="20"/>
+              </w:rPr>
+              <w:t>tests/test_llm_connection.py</w:t>
+            </w:r>
+          </w:p>
+        </w:tc>
+        <w:tc>
+          <w:tcPr>
+            <w:tcW w:type="dxa" w:w="2016"/>
+            <w:shd w:val="clear" w:color="auto" w:fill="F7FAFB"/>
+          </w:tcPr>
+          <w:p>
+            <w:pPr>
+              <w:spacing w:after="40"/>
+            </w:pPr>
+            <w:r/>
+            <w:r>
+              <w:rPr>
+                <w:b w:val="0"/>
+                <w:sz w:val="20"/>
+              </w:rPr>
+              <w:t>3</w:t>
+            </w:r>
+          </w:p>
+        </w:tc>
+        <w:tc>
+          <w:tcPr>
+            <w:tcW w:type="dxa" w:w="3744"/>
+            <w:shd w:val="clear" w:color="auto" w:fill="F7FAFB"/>
+          </w:tcPr>
+          <w:p>
+            <w:pPr>
+              <w:spacing w:after="40"/>
+            </w:pPr>
+            <w:r/>
+            <w:r>
+              <w:rPr>
+                <w:b w:val="0"/>
+                <w:sz w:val="20"/>
+              </w:rPr>
+              <w:t>Yes - live API</w:t>
+            </w:r>
+          </w:p>
+        </w:tc>
+      </w:tr>
+      <w:tr>
+        <w:tc>
+          <w:tcPr>
+            <w:tcW w:type="dxa" w:w="3744"/>
+          </w:tcPr>
+          <w:p>
+            <w:pPr>
+              <w:spacing w:after="40"/>
+            </w:pPr>
+            <w:r/>
+            <w:r>
+              <w:rPr>
+                <w:b/>
+                <w:sz w:val="20"/>
+              </w:rPr>
+              <w:t>TOTAL</w:t>
+            </w:r>
+          </w:p>
+        </w:tc>
+        <w:tc>
+          <w:tcPr>
+            <w:tcW w:type="dxa" w:w="2016"/>
+          </w:tcPr>
+          <w:p>
+            <w:pPr>
+              <w:spacing w:after="40"/>
+            </w:pPr>
+            <w:r/>
+            <w:r>
+              <w:rPr>
+                <w:b w:val="0"/>
+                <w:sz w:val="20"/>
+              </w:rPr>
+              <w:t>318 passing</w:t>
+            </w:r>
+          </w:p>
+        </w:tc>
+        <w:tc>
+          <w:tcPr>
+            <w:tcW w:type="dxa" w:w="3744"/>
+          </w:tcPr>
+          <w:p>
+            <w:pPr>
+              <w:spacing w:after="40"/>
+            </w:pPr>
+            <w:r/>
+            <w:r>
+              <w:rPr>
+                <w:b w:val="0"/>
+                <w:sz w:val="20"/>
+              </w:rPr>
+            </w:r>
+          </w:p>
+        </w:tc>
+      </w:tr>
+    </w:tbl>
+    <w:p>
+      <w:pPr>
+        <w:spacing w:after="80"/>
+      </w:pPr>
+    </w:p>
+    <w:tbl>
+      <w:tblPr>
+        <w:tblW w:type="auto" w:w="0"/>
+        <w:tblLook w:firstColumn="1" w:firstRow="1" w:lastColumn="0" w:lastRow="0" w:noHBand="0" w:noVBand="1" w:val="04A0"/>
+      </w:tblPr>
+      <w:tblGrid>
+        <w:gridCol w:w="9792"/>
+      </w:tblGrid>
+      <w:tr>
+        <w:tc>
+          <w:tcPr>
+            <w:tcW w:type="dxa" w:w="9792"/>
+            <w:shd w:val="clear" w:color="auto" w:fill="F4F4F4"/>
+          </w:tcPr>
+          <w:p>
+            <w:pPr>
+              <w:spacing w:after="0"/>
+            </w:pPr>
+            <w:r/>
+            <w:r>
+              <w:rPr>
+                <w:rFonts w:ascii="Consolas" w:hAnsi="Consolas"/>
+                <w:sz w:val="18"/>
+              </w:rPr>
+              <w:t>python -m pytest tests/ -q                      # all 318 tests</w:t>
+            </w:r>
+          </w:p>
+          <w:p>
+            <w:pPr>
+              <w:spacing w:after="0"/>
+            </w:pPr>
+            <w:r>
+              <w:rPr>
+                <w:rFonts w:ascii="Consolas" w:hAnsi="Consolas"/>
+                <w:sz w:val="18"/>
+              </w:rPr>
+              <w:t>python scripts/marketing_demo.py                # templates, free, no AI</w:t>
+            </w:r>
+          </w:p>
+          <w:p>
+            <w:pPr>
+              <w:spacing w:after="0"/>
+            </w:pPr>
+            <w:r>
+              <w:rPr>
+                <w:rFonts w:ascii="Consolas" w:hAnsi="Consolas"/>
+                <w:sz w:val="18"/>
+              </w:rPr>
+              <w:t>python scripts/marketing_demo.py --ai           # AI writes the copy</w:t>
+            </w:r>
+          </w:p>
+          <w:p>
+            <w:pPr>
+              <w:spacing w:after="0"/>
+            </w:pPr>
+            <w:r>
+              <w:rPr>
+                <w:rFonts w:ascii="Consolas" w:hAnsi="Consolas"/>
+                <w:sz w:val="18"/>
+              </w:rPr>
+              <w:t>python scripts/marketing_demo.py --chat --ai    # write your own adverts</w:t>
+            </w:r>
+          </w:p>
+        </w:tc>
+      </w:tr>
+    </w:tbl>
+    <w:p>
+      <w:pPr>
+        <w:spacing w:after="80"/>
+      </w:pPr>
+    </w:p>
+    <w:p>
+      <w:pPr>
+        <w:pStyle w:val="Heading2"/>
+        <w:spacing w:before="200" w:after="120"/>
+      </w:pPr>
+      <w:r>
+        <w:rPr>
+          <w:color w:val="17324D"/>
+        </w:rPr>
+        <w:t>16.11 What Day 9 does NOT include</w:t>
+      </w:r>
+    </w:p>
+    <w:p>
+      <w:pPr>
+        <w:pStyle w:val="ListBullet"/>
+        <w:spacing w:after="60"/>
+      </w:pPr>
+      <w:r>
+        <w:rPr>
+          <w:sz w:val="22"/>
+        </w:rPr>
+        <w:t>It does not send anything. The owner copies the text into WhatsApp themselves.</w:t>
+      </w:r>
+    </w:p>
+    <w:p>
+      <w:pPr>
+        <w:pStyle w:val="ListBullet"/>
+        <w:spacing w:after="60"/>
+      </w:pPr>
+      <w:r>
+        <w:rPr>
+          <w:sz w:val="22"/>
+        </w:rPr>
+        <w:t>No images or graphics - text only.</w:t>
+      </w:r>
+    </w:p>
+    <w:p>
+      <w:pPr>
+        <w:pStyle w:val="ListBullet"/>
+        <w:spacing w:after="60"/>
+      </w:pPr>
+      <w:r>
+        <w:rPr>
+          <w:sz w:val="22"/>
+        </w:rPr>
+        <w:t>No scheduling, no campaign calendar, no reminders.</w:t>
+      </w:r>
+    </w:p>
+    <w:p>
+      <w:pPr>
+        <w:pStyle w:val="ListBullet"/>
+        <w:spacing w:after="60"/>
+      </w:pPr>
+      <w:r>
+        <w:rPr>
+          <w:sz w:val="22"/>
+        </w:rPr>
+        <w:t>No way to measure whether an advert actually sold anything. That needs sales history.</w:t>
+      </w:r>
+    </w:p>
+    <w:p>
+      <w:pPr>
+        <w:pStyle w:val="ListBullet"/>
+        <w:spacing w:after="60"/>
+      </w:pPr>
+      <w:r>
+        <w:rPr>
+          <w:sz w:val="22"/>
+        </w:rPr>
+        <w:t>No competitor awareness, so it cannot claim to be cheaper than anyone.</w:t>
+      </w:r>
+    </w:p>
+    <w:p>
+      <w:pPr>
+        <w:pStyle w:val="ListBullet"/>
+        <w:spacing w:after="60"/>
+      </w:pPr>
+      <w:r>
+        <w:rPr>
+          <w:sz w:val="22"/>
+        </w:rPr>
+        <w:t>The isiZulu and Sesotho keyword lists still need a native-speaker review (issue M9).</w:t>
+      </w:r>
+    </w:p>
+    <w:p>
+      <w:pPr>
+        <w:spacing w:after="120"/>
+      </w:pPr>
+    </w:p>
+    <w:tbl>
+      <w:tblPr>
+        <w:tblW w:type="auto" w:w="0"/>
+        <w:tblLook w:firstColumn="1" w:firstRow="1" w:lastColumn="0" w:lastRow="0" w:noHBand="0" w:noVBand="1" w:val="04A0"/>
+      </w:tblPr>
+      <w:tblGrid>
+        <w:gridCol w:w="9792"/>
+      </w:tblGrid>
+      <w:tr>
+        <w:tc>
+          <w:tcPr>
+            <w:tcW w:type="dxa" w:w="9792"/>
+            <w:shd w:val="clear" w:color="auto" w:fill="EAF6F3"/>
+          </w:tcPr>
+          <w:p>
+            <w:pPr>
+              <w:spacing w:after="40"/>
+            </w:pPr>
+            <w:r>
+              <w:rPr>
+                <w:b/>
+                <w:color w:val="129B8E"/>
+                <w:sz w:val="21"/>
+              </w:rPr>
+              <w:t>PLAIN ENGLISH - Say this to management</w:t>
+            </w:r>
+          </w:p>
+          <w:p>
+            <w:pPr>
+              <w:spacing w:after="0"/>
+            </w:pPr>
+            <w:r>
+              <w:rPr>
+                <w:i/>
+                <w:sz w:val="21"/>
+              </w:rPr>
+              <w:t>"The owner can now ask for an advert and get a WhatsApp message, a Facebook caption and a poster for the window, all in their own language, all built from real prices and real stock. KasiBiz will also refuse to write an advert that would lose money or run the shop out of stock. What it cannot yet do is send the advert or tell them whether it worked."</w:t>
+            </w:r>
+          </w:p>
+        </w:tc>
+      </w:tr>
+    </w:tbl>
+    <w:p>
+      <w:pPr>
+        <w:spacing w:after="80"/>
+      </w:pPr>
+    </w:p>
+    <w:p>
+      <w:pPr>
+        <w:spacing w:after="120"/>
+      </w:pPr>
+    </w:p>
+    <w:p>
+      <w:pPr>
+        <w:spacing w:after="120"/>
+      </w:pPr>
+      <w:r>
+        <w:rPr>
+          <w:b w:val="0"/>
+          <w:i/>
+          <w:color w:val="5A5A5A"/>
+          <w:sz w:val="20"/>
+        </w:rPr>
+        <w:t>End of Day 9 addendum - handbook version 1.4, 10 September 2026.</w:t>
       </w:r>
     </w:p>
     <w:sectPr>

</xml_diff>